<commit_message>
Add final robustness checks for v1.1.0
</commit_message>
<xml_diff>
--- a/supplementary/Electricity_Supplementary_Materials_Tabatabaei_Cremers.docx
+++ b/supplementary/Electricity_Supplementary_Materials_Tabatabaei_Cremers.docx
@@ -109,6 +109,7 @@
       <w:tr>
         <w:trPr>
           <w:tblHeader w:val="true"/>
+          <w:cantSplit/>
         </w:trPr>
         <w:tc>
           <w:tcPr>
@@ -125,8 +126,8 @@
           <w:p>
             <w:pPr>
               <w:pStyle w:val="MDPI42tablebody"/>
-              <w:jc w:val="left"/>
-              <w:bidi w:val="0"/>
+              <w:keepLines/>
+              <w:jc w:val="left"/>
             </w:pPr>
             <w:r>
               <w:rPr>
@@ -152,8 +153,8 @@
           <w:p>
             <w:pPr>
               <w:pStyle w:val="MDPI42tablebody"/>
-              <w:jc w:val="left"/>
-              <w:bidi w:val="0"/>
+              <w:keepLines/>
+              <w:jc w:val="left"/>
             </w:pPr>
             <w:r>
               <w:rPr>
@@ -179,8 +180,8 @@
           <w:p>
             <w:pPr>
               <w:pStyle w:val="MDPI42tablebody"/>
-              <w:jc w:val="left"/>
-              <w:bidi w:val="0"/>
+              <w:keepLines/>
+              <w:jc w:val="left"/>
             </w:pPr>
             <w:r>
               <w:rPr>
@@ -193,6 +194,9 @@
         </w:tc>
       </w:tr>
       <w:tr>
+        <w:trPr>
+          <w:cantSplit/>
+        </w:trPr>
         <w:tc>
           <w:tcPr>
             <w:tcW w:type="dxa" w:w="4706"/>
@@ -207,8 +211,8 @@
           <w:p>
             <w:pPr>
               <w:pStyle w:val="MDPI42tablebody"/>
-              <w:jc w:val="left"/>
-              <w:bidi w:val="0"/>
+              <w:keepLines/>
+              <w:jc w:val="left"/>
             </w:pPr>
             <w:r>
               <w:rPr>
@@ -232,8 +236,8 @@
           <w:p>
             <w:pPr>
               <w:pStyle w:val="MDPI42tablebody"/>
-              <w:jc w:val="left"/>
-              <w:bidi w:val="0"/>
+              <w:keepLines/>
+              <w:jc w:val="left"/>
             </w:pPr>
             <w:r>
               <w:rPr>
@@ -257,8 +261,8 @@
           <w:p>
             <w:pPr>
               <w:pStyle w:val="MDPI42tablebody"/>
-              <w:jc w:val="left"/>
-              <w:bidi w:val="0"/>
+              <w:keepLines/>
+              <w:jc w:val="left"/>
             </w:pPr>
             <w:r>
               <w:rPr>
@@ -270,6 +274,9 @@
         </w:tc>
       </w:tr>
       <w:tr>
+        <w:trPr>
+          <w:cantSplit/>
+        </w:trPr>
         <w:tc>
           <w:tcPr>
             <w:tcW w:type="dxa" w:w="4706"/>
@@ -284,8 +291,8 @@
           <w:p>
             <w:pPr>
               <w:pStyle w:val="MDPI42tablebody"/>
-              <w:jc w:val="left"/>
-              <w:bidi w:val="0"/>
+              <w:keepLines/>
+              <w:jc w:val="left"/>
             </w:pPr>
             <w:r>
               <w:rPr>
@@ -309,8 +316,8 @@
           <w:p>
             <w:pPr>
               <w:pStyle w:val="MDPI42tablebody"/>
-              <w:jc w:val="left"/>
-              <w:bidi w:val="0"/>
+              <w:keepLines/>
+              <w:jc w:val="left"/>
             </w:pPr>
             <w:r>
               <w:rPr>
@@ -334,8 +341,8 @@
           <w:p>
             <w:pPr>
               <w:pStyle w:val="MDPI42tablebody"/>
-              <w:jc w:val="left"/>
-              <w:bidi w:val="0"/>
+              <w:keepLines/>
+              <w:jc w:val="left"/>
             </w:pPr>
             <w:r>
               <w:rPr>
@@ -347,6 +354,9 @@
         </w:tc>
       </w:tr>
       <w:tr>
+        <w:trPr>
+          <w:cantSplit/>
+        </w:trPr>
         <w:tc>
           <w:tcPr>
             <w:tcW w:type="dxa" w:w="4706"/>
@@ -361,8 +371,8 @@
           <w:p>
             <w:pPr>
               <w:pStyle w:val="MDPI42tablebody"/>
-              <w:jc w:val="left"/>
-              <w:bidi w:val="0"/>
+              <w:keepLines/>
+              <w:jc w:val="left"/>
             </w:pPr>
             <w:r>
               <w:rPr>
@@ -386,8 +396,8 @@
           <w:p>
             <w:pPr>
               <w:pStyle w:val="MDPI42tablebody"/>
-              <w:jc w:val="left"/>
-              <w:bidi w:val="0"/>
+              <w:keepLines/>
+              <w:jc w:val="left"/>
             </w:pPr>
             <w:r>
               <w:rPr>
@@ -411,8 +421,8 @@
           <w:p>
             <w:pPr>
               <w:pStyle w:val="MDPI42tablebody"/>
-              <w:jc w:val="left"/>
-              <w:bidi w:val="0"/>
+              <w:keepLines/>
+              <w:jc w:val="left"/>
             </w:pPr>
             <w:r>
               <w:rPr>
@@ -424,6 +434,9 @@
         </w:tc>
       </w:tr>
       <w:tr>
+        <w:trPr>
+          <w:cantSplit/>
+        </w:trPr>
         <w:tc>
           <w:tcPr>
             <w:tcW w:type="dxa" w:w="4706"/>
@@ -438,8 +451,8 @@
           <w:p>
             <w:pPr>
               <w:pStyle w:val="MDPI42tablebody"/>
-              <w:jc w:val="left"/>
-              <w:bidi w:val="0"/>
+              <w:keepLines/>
+              <w:jc w:val="left"/>
             </w:pPr>
             <w:r>
               <w:rPr>
@@ -463,8 +476,8 @@
           <w:p>
             <w:pPr>
               <w:pStyle w:val="MDPI42tablebody"/>
-              <w:jc w:val="left"/>
-              <w:bidi w:val="0"/>
+              <w:keepLines/>
+              <w:jc w:val="left"/>
             </w:pPr>
             <w:r>
               <w:rPr>
@@ -488,8 +501,8 @@
           <w:p>
             <w:pPr>
               <w:pStyle w:val="MDPI42tablebody"/>
-              <w:jc w:val="left"/>
-              <w:bidi w:val="0"/>
+              <w:keepLines/>
+              <w:jc w:val="left"/>
             </w:pPr>
             <w:r>
               <w:rPr>
@@ -533,6 +546,7 @@
       <w:tr>
         <w:trPr>
           <w:tblHeader w:val="true"/>
+          <w:cantSplit/>
         </w:trPr>
         <w:tc>
           <w:tcPr>
@@ -549,8 +563,8 @@
           <w:p>
             <w:pPr>
               <w:pStyle w:val="MDPI42tablebody"/>
-              <w:jc w:val="left"/>
-              <w:bidi w:val="0"/>
+              <w:keepLines/>
+              <w:jc w:val="left"/>
             </w:pPr>
             <w:r>
               <w:rPr>
@@ -576,8 +590,8 @@
           <w:p>
             <w:pPr>
               <w:pStyle w:val="MDPI42tablebody"/>
-              <w:jc w:val="left"/>
-              <w:bidi w:val="0"/>
+              <w:keepLines/>
+              <w:jc w:val="left"/>
             </w:pPr>
             <w:r>
               <w:rPr>
@@ -603,8 +617,8 @@
           <w:p>
             <w:pPr>
               <w:pStyle w:val="MDPI42tablebody"/>
-              <w:jc w:val="left"/>
-              <w:bidi w:val="0"/>
+              <w:keepLines/>
+              <w:jc w:val="left"/>
             </w:pPr>
             <w:r>
               <w:rPr>
@@ -617,6 +631,9 @@
         </w:tc>
       </w:tr>
       <w:tr>
+        <w:trPr>
+          <w:cantSplit/>
+        </w:trPr>
         <w:tc>
           <w:tcPr>
             <w:tcW w:type="dxa" w:w="3231"/>
@@ -631,8 +648,8 @@
           <w:p>
             <w:pPr>
               <w:pStyle w:val="MDPI42tablebody"/>
-              <w:jc w:val="left"/>
-              <w:bidi w:val="0"/>
+              <w:keepLines/>
+              <w:jc w:val="left"/>
             </w:pPr>
             <w:r>
               <w:rPr>
@@ -656,8 +673,8 @@
           <w:p>
             <w:pPr>
               <w:pStyle w:val="MDPI42tablebody"/>
-              <w:jc w:val="left"/>
-              <w:bidi w:val="0"/>
+              <w:keepLines/>
+              <w:jc w:val="left"/>
             </w:pPr>
             <w:r>
               <w:rPr>
@@ -681,8 +698,8 @@
           <w:p>
             <w:pPr>
               <w:pStyle w:val="MDPI42tablebody"/>
-              <w:jc w:val="left"/>
-              <w:bidi w:val="0"/>
+              <w:keepLines/>
+              <w:jc w:val="left"/>
             </w:pPr>
             <w:r>
               <w:rPr>
@@ -694,6 +711,9 @@
         </w:tc>
       </w:tr>
       <w:tr>
+        <w:trPr>
+          <w:cantSplit/>
+        </w:trPr>
         <w:tc>
           <w:tcPr>
             <w:tcW w:type="dxa" w:w="3231"/>
@@ -708,8 +728,8 @@
           <w:p>
             <w:pPr>
               <w:pStyle w:val="MDPI42tablebody"/>
-              <w:jc w:val="left"/>
-              <w:bidi w:val="0"/>
+              <w:keepLines/>
+              <w:jc w:val="left"/>
             </w:pPr>
             <w:r>
               <w:rPr>
@@ -732,15 +752,14 @@
           </w:tcPr>
           <w:p>
             <w:pPr>
-              <w:pStyle w:val="MDPI42tablebody"/>
-              <w:jc w:val="left"/>
-              <w:bidi w:val="0"/>
-            </w:pPr>
-            <w:r>
-              <w:rPr>
-                <w:sz w:val="13"/>
-              </w:rPr>
-              <w:t>&gt;=99% of smaller polygon</w:t>
+              <w:keepLines/>
+              <w:jc w:val="left"/>
+            </w:pPr>
+            <w:r>
+              <w:rPr>
+                <w:b w:val="0"/>
+              </w:rPr>
+              <w:t>≥99% of smaller polygon</w:t>
             </w:r>
           </w:p>
         </w:tc>
@@ -758,8 +777,8 @@
           <w:p>
             <w:pPr>
               <w:pStyle w:val="MDPI42tablebody"/>
-              <w:jc w:val="left"/>
-              <w:bidi w:val="0"/>
+              <w:keepLines/>
+              <w:jc w:val="left"/>
             </w:pPr>
             <w:r>
               <w:rPr>
@@ -771,6 +790,9 @@
         </w:tc>
       </w:tr>
       <w:tr>
+        <w:trPr>
+          <w:cantSplit/>
+        </w:trPr>
         <w:tc>
           <w:tcPr>
             <w:tcW w:type="dxa" w:w="3231"/>
@@ -785,8 +807,8 @@
           <w:p>
             <w:pPr>
               <w:pStyle w:val="MDPI42tablebody"/>
-              <w:jc w:val="left"/>
-              <w:bidi w:val="0"/>
+              <w:keepLines/>
+              <w:jc w:val="left"/>
             </w:pPr>
             <w:r>
               <w:rPr>
@@ -809,15 +831,14 @@
           </w:tcPr>
           <w:p>
             <w:pPr>
-              <w:pStyle w:val="MDPI42tablebody"/>
-              <w:jc w:val="left"/>
-              <w:bidi w:val="0"/>
-            </w:pPr>
-            <w:r>
-              <w:rPr>
-                <w:sz w:val="13"/>
-              </w:rPr>
-              <w:t>&lt;=1 degree</w:t>
+              <w:keepLines/>
+              <w:jc w:val="left"/>
+            </w:pPr>
+            <w:r>
+              <w:rPr>
+                <w:b w:val="0"/>
+              </w:rPr>
+              <w:t>≤1°</w:t>
             </w:r>
           </w:p>
         </w:tc>
@@ -835,8 +856,8 @@
           <w:p>
             <w:pPr>
               <w:pStyle w:val="MDPI42tablebody"/>
-              <w:jc w:val="left"/>
-              <w:bidi w:val="0"/>
+              <w:keepLines/>
+              <w:jc w:val="left"/>
             </w:pPr>
             <w:r>
               <w:rPr>
@@ -848,6 +869,9 @@
         </w:tc>
       </w:tr>
       <w:tr>
+        <w:trPr>
+          <w:cantSplit/>
+        </w:trPr>
         <w:tc>
           <w:tcPr>
             <w:tcW w:type="dxa" w:w="3231"/>
@@ -862,8 +886,8 @@
           <w:p>
             <w:pPr>
               <w:pStyle w:val="MDPI42tablebody"/>
-              <w:jc w:val="left"/>
-              <w:bidi w:val="0"/>
+              <w:keepLines/>
+              <w:jc w:val="left"/>
             </w:pPr>
             <w:r>
               <w:rPr>
@@ -886,15 +910,14 @@
           </w:tcPr>
           <w:p>
             <w:pPr>
-              <w:pStyle w:val="MDPI42tablebody"/>
-              <w:jc w:val="left"/>
-              <w:bidi w:val="0"/>
-            </w:pPr>
-            <w:r>
-              <w:rPr>
-                <w:sz w:val="13"/>
-              </w:rPr>
-              <w:t>&lt;=0.10 m</w:t>
+              <w:keepLines/>
+              <w:jc w:val="left"/>
+            </w:pPr>
+            <w:r>
+              <w:rPr>
+                <w:b w:val="0"/>
+              </w:rPr>
+              <w:t>≤0.10 m</w:t>
             </w:r>
           </w:p>
         </w:tc>
@@ -912,8 +935,8 @@
           <w:p>
             <w:pPr>
               <w:pStyle w:val="MDPI42tablebody"/>
-              <w:jc w:val="left"/>
-              <w:bidi w:val="0"/>
+              <w:keepLines/>
+              <w:jc w:val="left"/>
             </w:pPr>
             <w:r>
               <w:rPr>
@@ -925,6 +948,9 @@
         </w:tc>
       </w:tr>
       <w:tr>
+        <w:trPr>
+          <w:cantSplit/>
+        </w:trPr>
         <w:tc>
           <w:tcPr>
             <w:tcW w:type="dxa" w:w="3231"/>
@@ -939,8 +965,8 @@
           <w:p>
             <w:pPr>
               <w:pStyle w:val="MDPI42tablebody"/>
-              <w:jc w:val="left"/>
-              <w:bidi w:val="0"/>
+              <w:keepLines/>
+              <w:jc w:val="left"/>
             </w:pPr>
             <w:r>
               <w:rPr>
@@ -964,8 +990,8 @@
           <w:p>
             <w:pPr>
               <w:pStyle w:val="MDPI42tablebody"/>
-              <w:jc w:val="left"/>
-              <w:bidi w:val="0"/>
+              <w:keepLines/>
+              <w:jc w:val="left"/>
             </w:pPr>
             <w:r>
               <w:rPr>
@@ -989,8 +1015,8 @@
           <w:p>
             <w:pPr>
               <w:pStyle w:val="MDPI42tablebody"/>
-              <w:jc w:val="left"/>
-              <w:bidi w:val="0"/>
+              <w:keepLines/>
+              <w:jc w:val="left"/>
             </w:pPr>
             <w:r>
               <w:rPr>
@@ -1002,6 +1028,9 @@
         </w:tc>
       </w:tr>
       <w:tr>
+        <w:trPr>
+          <w:cantSplit/>
+        </w:trPr>
         <w:tc>
           <w:tcPr>
             <w:tcW w:type="dxa" w:w="3231"/>
@@ -1016,8 +1045,8 @@
           <w:p>
             <w:pPr>
               <w:pStyle w:val="MDPI42tablebody"/>
-              <w:jc w:val="left"/>
-              <w:bidi w:val="0"/>
+              <w:keepLines/>
+              <w:jc w:val="left"/>
             </w:pPr>
             <w:r>
               <w:rPr>
@@ -1041,8 +1070,8 @@
           <w:p>
             <w:pPr>
               <w:pStyle w:val="MDPI42tablebody"/>
-              <w:jc w:val="left"/>
-              <w:bidi w:val="0"/>
+              <w:keepLines/>
+              <w:jc w:val="left"/>
             </w:pPr>
             <w:r>
               <w:rPr>
@@ -1066,8 +1095,8 @@
           <w:p>
             <w:pPr>
               <w:pStyle w:val="MDPI42tablebody"/>
-              <w:jc w:val="left"/>
-              <w:bidi w:val="0"/>
+              <w:keepLines/>
+              <w:jc w:val="left"/>
             </w:pPr>
             <w:r>
               <w:rPr>
@@ -1079,6 +1108,9 @@
         </w:tc>
       </w:tr>
       <w:tr>
+        <w:trPr>
+          <w:cantSplit/>
+        </w:trPr>
         <w:tc>
           <w:tcPr>
             <w:tcW w:type="dxa" w:w="3231"/>
@@ -1093,8 +1125,8 @@
           <w:p>
             <w:pPr>
               <w:pStyle w:val="MDPI42tablebody"/>
-              <w:jc w:val="left"/>
-              <w:bidi w:val="0"/>
+              <w:keepLines/>
+              <w:jc w:val="left"/>
             </w:pPr>
             <w:r>
               <w:rPr>
@@ -1117,15 +1149,14 @@
           </w:tcPr>
           <w:p>
             <w:pPr>
-              <w:pStyle w:val="MDPI42tablebody"/>
-              <w:jc w:val="left"/>
-              <w:bidi w:val="0"/>
-            </w:pPr>
-            <w:r>
-              <w:rPr>
-                <w:sz w:val="13"/>
-              </w:rPr>
-              <w:t>LONGi LR5-54HTB-440M; 1.722 x 1.134 m; 440 W</w:t>
+              <w:keepLines/>
+              <w:jc w:val="left"/>
+            </w:pPr>
+            <w:r>
+              <w:rPr>
+                <w:b w:val="0"/>
+              </w:rPr>
+              <w:t>LONGi LR5-54HTB-440M; 1.722 × 1.134 m; 440 W</w:t>
             </w:r>
           </w:p>
         </w:tc>
@@ -1143,8 +1174,8 @@
           <w:p>
             <w:pPr>
               <w:pStyle w:val="MDPI42tablebody"/>
-              <w:jc w:val="left"/>
-              <w:bidi w:val="0"/>
+              <w:keepLines/>
+              <w:jc w:val="left"/>
             </w:pPr>
             <w:r>
               <w:rPr>
@@ -1156,6 +1187,9 @@
         </w:tc>
       </w:tr>
       <w:tr>
+        <w:trPr>
+          <w:cantSplit/>
+        </w:trPr>
         <w:tc>
           <w:tcPr>
             <w:tcW w:type="dxa" w:w="3231"/>
@@ -1170,8 +1204,8 @@
           <w:p>
             <w:pPr>
               <w:pStyle w:val="MDPI42tablebody"/>
-              <w:jc w:val="left"/>
-              <w:bidi w:val="0"/>
+              <w:keepLines/>
+              <w:jc w:val="left"/>
             </w:pPr>
             <w:r>
               <w:rPr>
@@ -1195,8 +1229,8 @@
           <w:p>
             <w:pPr>
               <w:pStyle w:val="MDPI42tablebody"/>
-              <w:jc w:val="left"/>
-              <w:bidi w:val="0"/>
+              <w:keepLines/>
+              <w:jc w:val="left"/>
             </w:pPr>
             <w:r>
               <w:rPr>
@@ -1220,8 +1254,8 @@
           <w:p>
             <w:pPr>
               <w:pStyle w:val="MDPI42tablebody"/>
-              <w:jc w:val="left"/>
-              <w:bidi w:val="0"/>
+              <w:keepLines/>
+              <w:jc w:val="left"/>
             </w:pPr>
             <w:r>
               <w:rPr>
@@ -1233,6 +1267,9 @@
         </w:tc>
       </w:tr>
       <w:tr>
+        <w:trPr>
+          <w:cantSplit/>
+        </w:trPr>
         <w:tc>
           <w:tcPr>
             <w:tcW w:type="dxa" w:w="3231"/>
@@ -1247,8 +1284,8 @@
           <w:p>
             <w:pPr>
               <w:pStyle w:val="MDPI42tablebody"/>
-              <w:jc w:val="left"/>
-              <w:bidi w:val="0"/>
+              <w:keepLines/>
+              <w:jc w:val="left"/>
             </w:pPr>
             <w:r>
               <w:rPr>
@@ -1271,15 +1308,14 @@
           </w:tcPr>
           <w:p>
             <w:pPr>
-              <w:pStyle w:val="MDPI42tablebody"/>
-              <w:jc w:val="left"/>
-              <w:bidi w:val="0"/>
-            </w:pPr>
-            <w:r>
-              <w:rPr>
-                <w:sz w:val="13"/>
-              </w:rPr>
-              <w:t>9 x 9 offsets per orientation</w:t>
+              <w:keepLines/>
+              <w:jc w:val="left"/>
+            </w:pPr>
+            <w:r>
+              <w:rPr>
+                <w:b w:val="0"/>
+              </w:rPr>
+              <w:t>9 × 9 offsets per orientation</w:t>
             </w:r>
           </w:p>
         </w:tc>
@@ -1297,8 +1333,8 @@
           <w:p>
             <w:pPr>
               <w:pStyle w:val="MDPI42tablebody"/>
-              <w:jc w:val="left"/>
-              <w:bidi w:val="0"/>
+              <w:keepLines/>
+              <w:jc w:val="left"/>
             </w:pPr>
             <w:r>
               <w:rPr>
@@ -1310,6 +1346,9 @@
         </w:tc>
       </w:tr>
       <w:tr>
+        <w:trPr>
+          <w:cantSplit/>
+        </w:trPr>
         <w:tc>
           <w:tcPr>
             <w:tcW w:type="dxa" w:w="3231"/>
@@ -1324,8 +1363,8 @@
           <w:p>
             <w:pPr>
               <w:pStyle w:val="MDPI42tablebody"/>
-              <w:jc w:val="left"/>
-              <w:bidi w:val="0"/>
+              <w:keepLines/>
+              <w:jc w:val="left"/>
             </w:pPr>
             <w:r>
               <w:rPr>
@@ -1348,15 +1387,14 @@
           </w:tcPr>
           <w:p>
             <w:pPr>
-              <w:pStyle w:val="MDPI42tablebody"/>
-              <w:jc w:val="left"/>
-              <w:bidi w:val="0"/>
-            </w:pPr>
-            <w:r>
-              <w:rPr>
-                <w:sz w:val="13"/>
-              </w:rPr>
-              <w:t>12 x 10 m outer geometry</w:t>
+              <w:keepLines/>
+              <w:jc w:val="left"/>
+            </w:pPr>
+            <w:r>
+              <w:rPr>
+                <w:b w:val="0"/>
+              </w:rPr>
+              <w:t>12 × 10 m outer geometry</w:t>
             </w:r>
           </w:p>
         </w:tc>
@@ -1374,8 +1412,8 @@
           <w:p>
             <w:pPr>
               <w:pStyle w:val="MDPI42tablebody"/>
-              <w:jc w:val="left"/>
-              <w:bidi w:val="0"/>
+              <w:keepLines/>
+              <w:jc w:val="left"/>
             </w:pPr>
             <w:r>
               <w:rPr>
@@ -1387,6 +1425,9 @@
         </w:tc>
       </w:tr>
       <w:tr>
+        <w:trPr>
+          <w:cantSplit/>
+        </w:trPr>
         <w:tc>
           <w:tcPr>
             <w:tcW w:type="dxa" w:w="3231"/>
@@ -1401,8 +1442,8 @@
           <w:p>
             <w:pPr>
               <w:pStyle w:val="MDPI42tablebody"/>
-              <w:jc w:val="left"/>
-              <w:bidi w:val="0"/>
+              <w:keepLines/>
+              <w:jc w:val="left"/>
             </w:pPr>
             <w:r>
               <w:rPr>
@@ -1425,15 +1466,14 @@
           </w:tcPr>
           <w:p>
             <w:pPr>
-              <w:pStyle w:val="MDPI42tablebody"/>
-              <w:jc w:val="left"/>
-              <w:bidi w:val="0"/>
-            </w:pPr>
-            <w:r>
-              <w:rPr>
-                <w:sz w:val="13"/>
-              </w:rPr>
-              <w:t>50 per facet count, 2-12 facets</w:t>
+              <w:keepLines/>
+              <w:jc w:val="left"/>
+            </w:pPr>
+            <w:r>
+              <w:rPr>
+                <w:b w:val="0"/>
+              </w:rPr>
+              <w:t>50 per facet count, 2–12 facets</w:t>
             </w:r>
           </w:p>
         </w:tc>
@@ -1451,8 +1491,8 @@
           <w:p>
             <w:pPr>
               <w:pStyle w:val="MDPI42tablebody"/>
-              <w:jc w:val="left"/>
-              <w:bidi w:val="0"/>
+              <w:keepLines/>
+              <w:jc w:val="left"/>
             </w:pPr>
             <w:r>
               <w:rPr>
@@ -1464,6 +1504,9 @@
         </w:tc>
       </w:tr>
       <w:tr>
+        <w:trPr>
+          <w:cantSplit/>
+        </w:trPr>
         <w:tc>
           <w:tcPr>
             <w:tcW w:type="dxa" w:w="3231"/>
@@ -1478,8 +1521,8 @@
           <w:p>
             <w:pPr>
               <w:pStyle w:val="MDPI42tablebody"/>
-              <w:jc w:val="left"/>
-              <w:bidi w:val="0"/>
+              <w:keepLines/>
+              <w:jc w:val="left"/>
             </w:pPr>
             <w:r>
               <w:rPr>
@@ -1503,8 +1546,8 @@
           <w:p>
             <w:pPr>
               <w:pStyle w:val="MDPI42tablebody"/>
-              <w:jc w:val="left"/>
-              <w:bidi w:val="0"/>
+              <w:keepLines/>
+              <w:jc w:val="left"/>
             </w:pPr>
             <w:r>
               <w:rPr>
@@ -1528,8 +1571,8 @@
           <w:p>
             <w:pPr>
               <w:pStyle w:val="MDPI42tablebody"/>
-              <w:jc w:val="left"/>
-              <w:bidi w:val="0"/>
+              <w:keepLines/>
+              <w:jc w:val="left"/>
             </w:pPr>
             <w:r>
               <w:rPr>
@@ -1546,29 +1589,32 @@
         <w:pStyle w:val="MDPI41tablecaption"/>
       </w:pPr>
       <w:r>
-        <w:t>Table S3. Physical-facet count under nearby consolidation tolerances.</w:t>
+        <w:t>Table S3. Coplanar-consolidation tolerance sensitivity. For each tolerance pair, physical facets were reconstructed and the affected building packings were recomputed before the aggregate shortfall and building-level facet-density association were recalculated. Across the grid, all raw two-sided correlation p-values were ≤0.00014.</w:t>
       </w:r>
     </w:p>
     <w:tbl>
       <w:tblPr>
-        <w:tblW w:type="auto" w:w="0"/>
+        <w:tblW w:type="dxa" w:w="8424"/>
         <w:jc w:val="center"/>
-        <w:tblLayout w:type="autofit"/>
+        <w:tblLayout w:type="fixed"/>
         <w:tblLook w:firstColumn="1" w:firstRow="1" w:lastColumn="0" w:lastRow="0" w:noHBand="0" w:noVBand="1" w:val="04A0"/>
         <w:bidiVisual w:val="0"/>
       </w:tblPr>
       <w:tblGrid>
-        <w:gridCol w:w="3489"/>
-        <w:gridCol w:w="3489"/>
-        <w:gridCol w:w="3489"/>
+        <w:gridCol w:w="1512"/>
+        <w:gridCol w:w="1655"/>
+        <w:gridCol w:w="1512"/>
+        <w:gridCol w:w="2232"/>
+        <w:gridCol w:w="1512"/>
       </w:tblGrid>
       <w:tr>
         <w:trPr>
           <w:tblHeader w:val="true"/>
+          <w:cantSplit/>
         </w:trPr>
         <w:tc>
           <w:tcPr>
-            <w:tcW w:type="dxa" w:w="3118"/>
+            <w:tcW w:type="dxa" w:w="1512"/>
             <w:tcMar>
               <w:top w:w="60" w:type="dxa"/>
               <w:start w:w="70" w:type="dxa"/>
@@ -1580,14 +1626,13 @@
           </w:tcPr>
           <w:p>
             <w:pPr>
-              <w:pStyle w:val="MDPI42tablebody"/>
-              <w:jc w:val="left"/>
-              <w:bidi w:val="0"/>
+              <w:keepLines/>
+              <w:jc w:val="left"/>
             </w:pPr>
             <w:r>
               <w:rPr>
                 <w:b/>
-                <w:sz w:val="14"/>
+                <w:sz w:val="17"/>
               </w:rPr>
               <w:t>Normal tolerance</w:t>
             </w:r>
@@ -1595,7 +1640,7 @@
         </w:tc>
         <w:tc>
           <w:tcPr>
-            <w:tcW w:type="dxa" w:w="3118"/>
+            <w:tcW w:type="dxa" w:w="1655"/>
             <w:tcMar>
               <w:top w:w="60" w:type="dxa"/>
               <w:start w:w="70" w:type="dxa"/>
@@ -1607,14 +1652,13 @@
           </w:tcPr>
           <w:p>
             <w:pPr>
-              <w:pStyle w:val="MDPI42tablebody"/>
-              <w:jc w:val="left"/>
-              <w:bidi w:val="0"/>
+              <w:keepLines/>
+              <w:jc w:val="left"/>
             </w:pPr>
             <w:r>
               <w:rPr>
                 <w:b/>
-                <w:sz w:val="14"/>
+                <w:sz w:val="17"/>
               </w:rPr>
               <w:t>Vertical tolerance</w:t>
             </w:r>
@@ -1622,7 +1666,7 @@
         </w:tc>
         <w:tc>
           <w:tcPr>
-            <w:tcW w:type="dxa" w:w="2551"/>
+            <w:tcW w:type="dxa" w:w="1512"/>
             <w:tcMar>
               <w:top w:w="60" w:type="dxa"/>
               <w:start w:w="70" w:type="dxa"/>
@@ -1634,66 +1678,106 @@
           </w:tcPr>
           <w:p>
             <w:pPr>
-              <w:pStyle w:val="MDPI42tablebody"/>
-              <w:jc w:val="left"/>
-              <w:bidi w:val="0"/>
+              <w:keepLines/>
+              <w:jc w:val="left"/>
             </w:pPr>
             <w:r>
               <w:rPr>
                 <w:b/>
-                <w:sz w:val="14"/>
+                <w:sz w:val="17"/>
               </w:rPr>
               <w:t>Physical facets</w:t>
+            </w:r>
+          </w:p>
+        </w:tc>
+        <w:tc>
+          <w:tcPr>
+            <w:tcW w:type="dxa" w:w="2232"/>
+            <w:vAlign w:val="center"/>
+          </w:tcPr>
+          <w:p>
+            <w:pPr>
+              <w:keepLines/>
+              <w:jc w:val="left"/>
+            </w:pPr>
+            <w:r>
+              <w:rPr>
+                <w:b/>
+                <w:sz w:val="17"/>
+              </w:rPr>
+              <w:t>Aggregate shortfall (%)</w:t>
+            </w:r>
+          </w:p>
+        </w:tc>
+        <w:tc>
+          <w:tcPr>
+            <w:tcW w:type="dxa" w:w="1512"/>
+            <w:vAlign w:val="center"/>
+          </w:tcPr>
+          <w:p>
+            <w:pPr>
+              <w:keepLines/>
+              <w:jc w:val="left"/>
+            </w:pPr>
+            <w:r>
+              <w:rPr>
+                <w:b/>
+                <w:sz w:val="17"/>
+              </w:rPr>
+              <w:t>Spearman ρ</w:t>
             </w:r>
           </w:p>
         </w:tc>
       </w:tr>
       <w:tr>
-        <w:tc>
-          <w:tcPr>
-            <w:tcW w:type="dxa" w:w="3118"/>
-            <w:tcMar>
-              <w:top w:w="60" w:type="dxa"/>
-              <w:start w:w="70" w:type="dxa"/>
-              <w:bottom w:w="60" w:type="dxa"/>
-              <w:end w:w="70" w:type="dxa"/>
-            </w:tcMar>
-            <w:vAlign w:val="center"/>
-          </w:tcPr>
-          <w:p>
-            <w:pPr>
-              <w:pStyle w:val="MDPI42tablebody"/>
-              <w:jc w:val="left"/>
-              <w:bidi w:val="0"/>
-            </w:pPr>
-            <w:r>
-              <w:rPr>
-                <w:sz w:val="14"/>
-              </w:rPr>
-              <w:t>0.5 degree</w:t>
-            </w:r>
-          </w:p>
-        </w:tc>
-        <w:tc>
-          <w:tcPr>
-            <w:tcW w:type="dxa" w:w="3118"/>
-            <w:tcMar>
-              <w:top w:w="60" w:type="dxa"/>
-              <w:start w:w="70" w:type="dxa"/>
-              <w:bottom w:w="60" w:type="dxa"/>
-              <w:end w:w="70" w:type="dxa"/>
-            </w:tcMar>
-            <w:vAlign w:val="center"/>
-          </w:tcPr>
-          <w:p>
-            <w:pPr>
-              <w:pStyle w:val="MDPI42tablebody"/>
-              <w:jc w:val="left"/>
-              <w:bidi w:val="0"/>
-            </w:pPr>
-            <w:r>
-              <w:rPr>
-                <w:sz w:val="14"/>
+        <w:trPr>
+          <w:cantSplit/>
+        </w:trPr>
+        <w:tc>
+          <w:tcPr>
+            <w:tcW w:type="dxa" w:w="1512"/>
+            <w:tcMar>
+              <w:top w:w="60" w:type="dxa"/>
+              <w:start w:w="70" w:type="dxa"/>
+              <w:bottom w:w="60" w:type="dxa"/>
+              <w:end w:w="70" w:type="dxa"/>
+            </w:tcMar>
+            <w:vAlign w:val="center"/>
+          </w:tcPr>
+          <w:p>
+            <w:pPr>
+              <w:keepLines/>
+              <w:jc w:val="left"/>
+            </w:pPr>
+            <w:r>
+              <w:rPr>
+                <w:b w:val="0"/>
+                <w:sz w:val="17"/>
+              </w:rPr>
+              <w:t>0.5°</w:t>
+            </w:r>
+          </w:p>
+        </w:tc>
+        <w:tc>
+          <w:tcPr>
+            <w:tcW w:type="dxa" w:w="1655"/>
+            <w:tcMar>
+              <w:top w:w="60" w:type="dxa"/>
+              <w:start w:w="70" w:type="dxa"/>
+              <w:bottom w:w="60" w:type="dxa"/>
+              <w:end w:w="70" w:type="dxa"/>
+            </w:tcMar>
+            <w:vAlign w:val="center"/>
+          </w:tcPr>
+          <w:p>
+            <w:pPr>
+              <w:keepLines/>
+              <w:jc w:val="left"/>
+            </w:pPr>
+            <w:r>
+              <w:rPr>
+                <w:b w:val="0"/>
+                <w:sz w:val="17"/>
               </w:rPr>
               <w:t>0.05 m</w:t>
             </w:r>
@@ -1701,76 +1785,117 @@
         </w:tc>
         <w:tc>
           <w:tcPr>
-            <w:tcW w:type="dxa" w:w="2551"/>
-            <w:tcMar>
-              <w:top w:w="60" w:type="dxa"/>
-              <w:start w:w="70" w:type="dxa"/>
-              <w:bottom w:w="60" w:type="dxa"/>
-              <w:end w:w="70" w:type="dxa"/>
-            </w:tcMar>
-            <w:vAlign w:val="center"/>
-          </w:tcPr>
-          <w:p>
-            <w:pPr>
-              <w:pStyle w:val="MDPI42tablebody"/>
-              <w:jc w:val="left"/>
-              <w:bidi w:val="0"/>
-            </w:pPr>
-            <w:r>
-              <w:rPr>
-                <w:sz w:val="14"/>
+            <w:tcW w:type="dxa" w:w="1512"/>
+            <w:tcMar>
+              <w:top w:w="60" w:type="dxa"/>
+              <w:start w:w="70" w:type="dxa"/>
+              <w:bottom w:w="60" w:type="dxa"/>
+              <w:end w:w="70" w:type="dxa"/>
+            </w:tcMar>
+            <w:vAlign w:val="center"/>
+          </w:tcPr>
+          <w:p>
+            <w:pPr>
+              <w:keepLines/>
+              <w:jc w:val="left"/>
+            </w:pPr>
+            <w:r>
+              <w:rPr>
+                <w:b w:val="0"/>
+                <w:sz w:val="17"/>
               </w:rPr>
               <w:t>342</w:t>
+            </w:r>
+          </w:p>
+        </w:tc>
+        <w:tc>
+          <w:tcPr>
+            <w:tcW w:type="dxa" w:w="2232"/>
+            <w:vAlign w:val="center"/>
+          </w:tcPr>
+          <w:p>
+            <w:pPr>
+              <w:keepLines/>
+              <w:jc w:val="left"/>
+            </w:pPr>
+            <w:r>
+              <w:rPr>
+                <w:b w:val="0"/>
+                <w:sz w:val="17"/>
+              </w:rPr>
+              <w:t>14.271</w:t>
+            </w:r>
+          </w:p>
+        </w:tc>
+        <w:tc>
+          <w:tcPr>
+            <w:tcW w:type="dxa" w:w="1512"/>
+            <w:vAlign w:val="center"/>
+          </w:tcPr>
+          <w:p>
+            <w:pPr>
+              <w:keepLines/>
+              <w:jc w:val="left"/>
+            </w:pPr>
+            <w:r>
+              <w:rPr>
+                <w:b w:val="0"/>
+                <w:sz w:val="17"/>
+              </w:rPr>
+              <w:t>0.657</w:t>
             </w:r>
           </w:p>
         </w:tc>
       </w:tr>
       <w:tr>
-        <w:tc>
-          <w:tcPr>
-            <w:tcW w:type="dxa" w:w="3118"/>
-            <w:tcMar>
-              <w:top w:w="60" w:type="dxa"/>
-              <w:start w:w="70" w:type="dxa"/>
-              <w:bottom w:w="60" w:type="dxa"/>
-              <w:end w:w="70" w:type="dxa"/>
-            </w:tcMar>
-            <w:vAlign w:val="center"/>
-          </w:tcPr>
-          <w:p>
-            <w:pPr>
-              <w:pStyle w:val="MDPI42tablebody"/>
-              <w:jc w:val="left"/>
-              <w:bidi w:val="0"/>
-            </w:pPr>
-            <w:r>
-              <w:rPr>
-                <w:sz w:val="14"/>
-              </w:rPr>
-              <w:t>0.5 degree</w:t>
-            </w:r>
-          </w:p>
-        </w:tc>
-        <w:tc>
-          <w:tcPr>
-            <w:tcW w:type="dxa" w:w="3118"/>
-            <w:tcMar>
-              <w:top w:w="60" w:type="dxa"/>
-              <w:start w:w="70" w:type="dxa"/>
-              <w:bottom w:w="60" w:type="dxa"/>
-              <w:end w:w="70" w:type="dxa"/>
-            </w:tcMar>
-            <w:vAlign w:val="center"/>
-          </w:tcPr>
-          <w:p>
-            <w:pPr>
-              <w:pStyle w:val="MDPI42tablebody"/>
-              <w:jc w:val="left"/>
-              <w:bidi w:val="0"/>
-            </w:pPr>
-            <w:r>
-              <w:rPr>
-                <w:sz w:val="14"/>
+        <w:trPr>
+          <w:cantSplit/>
+        </w:trPr>
+        <w:tc>
+          <w:tcPr>
+            <w:tcW w:type="dxa" w:w="1512"/>
+            <w:tcMar>
+              <w:top w:w="60" w:type="dxa"/>
+              <w:start w:w="70" w:type="dxa"/>
+              <w:bottom w:w="60" w:type="dxa"/>
+              <w:end w:w="70" w:type="dxa"/>
+            </w:tcMar>
+            <w:vAlign w:val="center"/>
+          </w:tcPr>
+          <w:p>
+            <w:pPr>
+              <w:keepLines/>
+              <w:jc w:val="left"/>
+            </w:pPr>
+            <w:r>
+              <w:rPr>
+                <w:b w:val="0"/>
+                <w:sz w:val="17"/>
+              </w:rPr>
+              <w:t>0.5°</w:t>
+            </w:r>
+          </w:p>
+        </w:tc>
+        <w:tc>
+          <w:tcPr>
+            <w:tcW w:type="dxa" w:w="1655"/>
+            <w:tcMar>
+              <w:top w:w="60" w:type="dxa"/>
+              <w:start w:w="70" w:type="dxa"/>
+              <w:bottom w:w="60" w:type="dxa"/>
+              <w:end w:w="70" w:type="dxa"/>
+            </w:tcMar>
+            <w:vAlign w:val="center"/>
+          </w:tcPr>
+          <w:p>
+            <w:pPr>
+              <w:keepLines/>
+              <w:jc w:val="left"/>
+            </w:pPr>
+            <w:r>
+              <w:rPr>
+                <w:b w:val="0"/>
+                <w:sz w:val="17"/>
               </w:rPr>
               <w:t>0.10 m</w:t>
             </w:r>
@@ -1778,76 +1903,117 @@
         </w:tc>
         <w:tc>
           <w:tcPr>
-            <w:tcW w:type="dxa" w:w="2551"/>
-            <w:tcMar>
-              <w:top w:w="60" w:type="dxa"/>
-              <w:start w:w="70" w:type="dxa"/>
-              <w:bottom w:w="60" w:type="dxa"/>
-              <w:end w:w="70" w:type="dxa"/>
-            </w:tcMar>
-            <w:vAlign w:val="center"/>
-          </w:tcPr>
-          <w:p>
-            <w:pPr>
-              <w:pStyle w:val="MDPI42tablebody"/>
-              <w:jc w:val="left"/>
-              <w:bidi w:val="0"/>
-            </w:pPr>
-            <w:r>
-              <w:rPr>
-                <w:sz w:val="14"/>
+            <w:tcW w:type="dxa" w:w="1512"/>
+            <w:tcMar>
+              <w:top w:w="60" w:type="dxa"/>
+              <w:start w:w="70" w:type="dxa"/>
+              <w:bottom w:w="60" w:type="dxa"/>
+              <w:end w:w="70" w:type="dxa"/>
+            </w:tcMar>
+            <w:vAlign w:val="center"/>
+          </w:tcPr>
+          <w:p>
+            <w:pPr>
+              <w:keepLines/>
+              <w:jc w:val="left"/>
+            </w:pPr>
+            <w:r>
+              <w:rPr>
+                <w:b w:val="0"/>
+                <w:sz w:val="17"/>
               </w:rPr>
               <w:t>341</w:t>
+            </w:r>
+          </w:p>
+        </w:tc>
+        <w:tc>
+          <w:tcPr>
+            <w:tcW w:type="dxa" w:w="2232"/>
+            <w:vAlign w:val="center"/>
+          </w:tcPr>
+          <w:p>
+            <w:pPr>
+              <w:keepLines/>
+              <w:jc w:val="left"/>
+            </w:pPr>
+            <w:r>
+              <w:rPr>
+                <w:b w:val="0"/>
+                <w:sz w:val="17"/>
+              </w:rPr>
+              <w:t>14.259</w:t>
+            </w:r>
+          </w:p>
+        </w:tc>
+        <w:tc>
+          <w:tcPr>
+            <w:tcW w:type="dxa" w:w="1512"/>
+            <w:vAlign w:val="center"/>
+          </w:tcPr>
+          <w:p>
+            <w:pPr>
+              <w:keepLines/>
+              <w:jc w:val="left"/>
+            </w:pPr>
+            <w:r>
+              <w:rPr>
+                <w:b w:val="0"/>
+                <w:sz w:val="17"/>
+              </w:rPr>
+              <w:t>0.637</w:t>
             </w:r>
           </w:p>
         </w:tc>
       </w:tr>
       <w:tr>
-        <w:tc>
-          <w:tcPr>
-            <w:tcW w:type="dxa" w:w="3118"/>
-            <w:tcMar>
-              <w:top w:w="60" w:type="dxa"/>
-              <w:start w:w="70" w:type="dxa"/>
-              <w:bottom w:w="60" w:type="dxa"/>
-              <w:end w:w="70" w:type="dxa"/>
-            </w:tcMar>
-            <w:vAlign w:val="center"/>
-          </w:tcPr>
-          <w:p>
-            <w:pPr>
-              <w:pStyle w:val="MDPI42tablebody"/>
-              <w:jc w:val="left"/>
-              <w:bidi w:val="0"/>
-            </w:pPr>
-            <w:r>
-              <w:rPr>
-                <w:sz w:val="14"/>
-              </w:rPr>
-              <w:t>1.0 degree</w:t>
-            </w:r>
-          </w:p>
-        </w:tc>
-        <w:tc>
-          <w:tcPr>
-            <w:tcW w:type="dxa" w:w="3118"/>
-            <w:tcMar>
-              <w:top w:w="60" w:type="dxa"/>
-              <w:start w:w="70" w:type="dxa"/>
-              <w:bottom w:w="60" w:type="dxa"/>
-              <w:end w:w="70" w:type="dxa"/>
-            </w:tcMar>
-            <w:vAlign w:val="center"/>
-          </w:tcPr>
-          <w:p>
-            <w:pPr>
-              <w:pStyle w:val="MDPI42tablebody"/>
-              <w:jc w:val="left"/>
-              <w:bidi w:val="0"/>
-            </w:pPr>
-            <w:r>
-              <w:rPr>
-                <w:sz w:val="14"/>
+        <w:trPr>
+          <w:cantSplit/>
+        </w:trPr>
+        <w:tc>
+          <w:tcPr>
+            <w:tcW w:type="dxa" w:w="1512"/>
+            <w:tcMar>
+              <w:top w:w="60" w:type="dxa"/>
+              <w:start w:w="70" w:type="dxa"/>
+              <w:bottom w:w="60" w:type="dxa"/>
+              <w:end w:w="70" w:type="dxa"/>
+            </w:tcMar>
+            <w:vAlign w:val="center"/>
+          </w:tcPr>
+          <w:p>
+            <w:pPr>
+              <w:keepLines/>
+              <w:jc w:val="left"/>
+            </w:pPr>
+            <w:r>
+              <w:rPr>
+                <w:b w:val="0"/>
+                <w:sz w:val="17"/>
+              </w:rPr>
+              <w:t>1.0°</w:t>
+            </w:r>
+          </w:p>
+        </w:tc>
+        <w:tc>
+          <w:tcPr>
+            <w:tcW w:type="dxa" w:w="1655"/>
+            <w:tcMar>
+              <w:top w:w="60" w:type="dxa"/>
+              <w:start w:w="70" w:type="dxa"/>
+              <w:bottom w:w="60" w:type="dxa"/>
+              <w:end w:w="70" w:type="dxa"/>
+            </w:tcMar>
+            <w:vAlign w:val="center"/>
+          </w:tcPr>
+          <w:p>
+            <w:pPr>
+              <w:keepLines/>
+              <w:jc w:val="left"/>
+            </w:pPr>
+            <w:r>
+              <w:rPr>
+                <w:b w:val="0"/>
+                <w:sz w:val="17"/>
               </w:rPr>
               <w:t>0.05 m</w:t>
             </w:r>
@@ -1855,76 +2021,117 @@
         </w:tc>
         <w:tc>
           <w:tcPr>
-            <w:tcW w:type="dxa" w:w="2551"/>
-            <w:tcMar>
-              <w:top w:w="60" w:type="dxa"/>
-              <w:start w:w="70" w:type="dxa"/>
-              <w:bottom w:w="60" w:type="dxa"/>
-              <w:end w:w="70" w:type="dxa"/>
-            </w:tcMar>
-            <w:vAlign w:val="center"/>
-          </w:tcPr>
-          <w:p>
-            <w:pPr>
-              <w:pStyle w:val="MDPI42tablebody"/>
-              <w:jc w:val="left"/>
-              <w:bidi w:val="0"/>
-            </w:pPr>
-            <w:r>
-              <w:rPr>
-                <w:sz w:val="14"/>
+            <w:tcW w:type="dxa" w:w="1512"/>
+            <w:tcMar>
+              <w:top w:w="60" w:type="dxa"/>
+              <w:start w:w="70" w:type="dxa"/>
+              <w:bottom w:w="60" w:type="dxa"/>
+              <w:end w:w="70" w:type="dxa"/>
+            </w:tcMar>
+            <w:vAlign w:val="center"/>
+          </w:tcPr>
+          <w:p>
+            <w:pPr>
+              <w:keepLines/>
+              <w:jc w:val="left"/>
+            </w:pPr>
+            <w:r>
+              <w:rPr>
+                <w:b w:val="0"/>
+                <w:sz w:val="17"/>
               </w:rPr>
               <w:t>341</w:t>
+            </w:r>
+          </w:p>
+        </w:tc>
+        <w:tc>
+          <w:tcPr>
+            <w:tcW w:type="dxa" w:w="2232"/>
+            <w:vAlign w:val="center"/>
+          </w:tcPr>
+          <w:p>
+            <w:pPr>
+              <w:keepLines/>
+              <w:jc w:val="left"/>
+            </w:pPr>
+            <w:r>
+              <w:rPr>
+                <w:b w:val="0"/>
+                <w:sz w:val="17"/>
+              </w:rPr>
+              <w:t>14.277</w:t>
+            </w:r>
+          </w:p>
+        </w:tc>
+        <w:tc>
+          <w:tcPr>
+            <w:tcW w:type="dxa" w:w="1512"/>
+            <w:vAlign w:val="center"/>
+          </w:tcPr>
+          <w:p>
+            <w:pPr>
+              <w:keepLines/>
+              <w:jc w:val="left"/>
+            </w:pPr>
+            <w:r>
+              <w:rPr>
+                <w:b w:val="0"/>
+                <w:sz w:val="17"/>
+              </w:rPr>
+              <w:t>0.652</w:t>
             </w:r>
           </w:p>
         </w:tc>
       </w:tr>
       <w:tr>
-        <w:tc>
-          <w:tcPr>
-            <w:tcW w:type="dxa" w:w="3118"/>
-            <w:tcMar>
-              <w:top w:w="60" w:type="dxa"/>
-              <w:start w:w="70" w:type="dxa"/>
-              <w:bottom w:w="60" w:type="dxa"/>
-              <w:end w:w="70" w:type="dxa"/>
-            </w:tcMar>
-            <w:vAlign w:val="center"/>
-          </w:tcPr>
-          <w:p>
-            <w:pPr>
-              <w:pStyle w:val="MDPI42tablebody"/>
-              <w:jc w:val="left"/>
-              <w:bidi w:val="0"/>
-            </w:pPr>
-            <w:r>
-              <w:rPr>
-                <w:sz w:val="14"/>
-              </w:rPr>
-              <w:t>1.0 degree</w:t>
-            </w:r>
-          </w:p>
-        </w:tc>
-        <w:tc>
-          <w:tcPr>
-            <w:tcW w:type="dxa" w:w="3118"/>
-            <w:tcMar>
-              <w:top w:w="60" w:type="dxa"/>
-              <w:start w:w="70" w:type="dxa"/>
-              <w:bottom w:w="60" w:type="dxa"/>
-              <w:end w:w="70" w:type="dxa"/>
-            </w:tcMar>
-            <w:vAlign w:val="center"/>
-          </w:tcPr>
-          <w:p>
-            <w:pPr>
-              <w:pStyle w:val="MDPI42tablebody"/>
-              <w:jc w:val="left"/>
-              <w:bidi w:val="0"/>
-            </w:pPr>
-            <w:r>
-              <w:rPr>
-                <w:sz w:val="14"/>
+        <w:trPr>
+          <w:cantSplit/>
+        </w:trPr>
+        <w:tc>
+          <w:tcPr>
+            <w:tcW w:type="dxa" w:w="1512"/>
+            <w:tcMar>
+              <w:top w:w="60" w:type="dxa"/>
+              <w:start w:w="70" w:type="dxa"/>
+              <w:bottom w:w="60" w:type="dxa"/>
+              <w:end w:w="70" w:type="dxa"/>
+            </w:tcMar>
+            <w:vAlign w:val="center"/>
+          </w:tcPr>
+          <w:p>
+            <w:pPr>
+              <w:keepLines/>
+              <w:jc w:val="left"/>
+            </w:pPr>
+            <w:r>
+              <w:rPr>
+                <w:b w:val="0"/>
+                <w:sz w:val="17"/>
+              </w:rPr>
+              <w:t>1.0°</w:t>
+            </w:r>
+          </w:p>
+        </w:tc>
+        <w:tc>
+          <w:tcPr>
+            <w:tcW w:type="dxa" w:w="1655"/>
+            <w:tcMar>
+              <w:top w:w="60" w:type="dxa"/>
+              <w:start w:w="70" w:type="dxa"/>
+              <w:bottom w:w="60" w:type="dxa"/>
+              <w:end w:w="70" w:type="dxa"/>
+            </w:tcMar>
+            <w:vAlign w:val="center"/>
+          </w:tcPr>
+          <w:p>
+            <w:pPr>
+              <w:keepLines/>
+              <w:jc w:val="left"/>
+            </w:pPr>
+            <w:r>
+              <w:rPr>
+                <w:b w:val="0"/>
+                <w:sz w:val="17"/>
               </w:rPr>
               <w:t>0.10 m (base)</w:t>
             </w:r>
@@ -1932,76 +2139,117 @@
         </w:tc>
         <w:tc>
           <w:tcPr>
-            <w:tcW w:type="dxa" w:w="2551"/>
-            <w:tcMar>
-              <w:top w:w="60" w:type="dxa"/>
-              <w:start w:w="70" w:type="dxa"/>
-              <w:bottom w:w="60" w:type="dxa"/>
-              <w:end w:w="70" w:type="dxa"/>
-            </w:tcMar>
-            <w:vAlign w:val="center"/>
-          </w:tcPr>
-          <w:p>
-            <w:pPr>
-              <w:pStyle w:val="MDPI42tablebody"/>
-              <w:jc w:val="left"/>
-              <w:bidi w:val="0"/>
-            </w:pPr>
-            <w:r>
-              <w:rPr>
-                <w:sz w:val="14"/>
+            <w:tcW w:type="dxa" w:w="1512"/>
+            <w:tcMar>
+              <w:top w:w="60" w:type="dxa"/>
+              <w:start w:w="70" w:type="dxa"/>
+              <w:bottom w:w="60" w:type="dxa"/>
+              <w:end w:w="70" w:type="dxa"/>
+            </w:tcMar>
+            <w:vAlign w:val="center"/>
+          </w:tcPr>
+          <w:p>
+            <w:pPr>
+              <w:keepLines/>
+              <w:jc w:val="left"/>
+            </w:pPr>
+            <w:r>
+              <w:rPr>
+                <w:b w:val="0"/>
+                <w:sz w:val="17"/>
               </w:rPr>
               <w:t>340</w:t>
+            </w:r>
+          </w:p>
+        </w:tc>
+        <w:tc>
+          <w:tcPr>
+            <w:tcW w:type="dxa" w:w="2232"/>
+            <w:vAlign w:val="center"/>
+          </w:tcPr>
+          <w:p>
+            <w:pPr>
+              <w:keepLines/>
+              <w:jc w:val="left"/>
+            </w:pPr>
+            <w:r>
+              <w:rPr>
+                <w:b w:val="0"/>
+                <w:sz w:val="17"/>
+              </w:rPr>
+              <w:t>14.265</w:t>
+            </w:r>
+          </w:p>
+        </w:tc>
+        <w:tc>
+          <w:tcPr>
+            <w:tcW w:type="dxa" w:w="1512"/>
+            <w:vAlign w:val="center"/>
+          </w:tcPr>
+          <w:p>
+            <w:pPr>
+              <w:keepLines/>
+              <w:jc w:val="left"/>
+            </w:pPr>
+            <w:r>
+              <w:rPr>
+                <w:b w:val="0"/>
+                <w:sz w:val="17"/>
+              </w:rPr>
+              <w:t>0.631</w:t>
             </w:r>
           </w:p>
         </w:tc>
       </w:tr>
       <w:tr>
-        <w:tc>
-          <w:tcPr>
-            <w:tcW w:type="dxa" w:w="3118"/>
-            <w:tcMar>
-              <w:top w:w="60" w:type="dxa"/>
-              <w:start w:w="70" w:type="dxa"/>
-              <w:bottom w:w="60" w:type="dxa"/>
-              <w:end w:w="70" w:type="dxa"/>
-            </w:tcMar>
-            <w:vAlign w:val="center"/>
-          </w:tcPr>
-          <w:p>
-            <w:pPr>
-              <w:pStyle w:val="MDPI42tablebody"/>
-              <w:jc w:val="left"/>
-              <w:bidi w:val="0"/>
-            </w:pPr>
-            <w:r>
-              <w:rPr>
-                <w:sz w:val="14"/>
-              </w:rPr>
-              <w:t>1.0 degree</w:t>
-            </w:r>
-          </w:p>
-        </w:tc>
-        <w:tc>
-          <w:tcPr>
-            <w:tcW w:type="dxa" w:w="3118"/>
-            <w:tcMar>
-              <w:top w:w="60" w:type="dxa"/>
-              <w:start w:w="70" w:type="dxa"/>
-              <w:bottom w:w="60" w:type="dxa"/>
-              <w:end w:w="70" w:type="dxa"/>
-            </w:tcMar>
-            <w:vAlign w:val="center"/>
-          </w:tcPr>
-          <w:p>
-            <w:pPr>
-              <w:pStyle w:val="MDPI42tablebody"/>
-              <w:jc w:val="left"/>
-              <w:bidi w:val="0"/>
-            </w:pPr>
-            <w:r>
-              <w:rPr>
-                <w:sz w:val="14"/>
+        <w:trPr>
+          <w:cantSplit/>
+        </w:trPr>
+        <w:tc>
+          <w:tcPr>
+            <w:tcW w:type="dxa" w:w="1512"/>
+            <w:tcMar>
+              <w:top w:w="60" w:type="dxa"/>
+              <w:start w:w="70" w:type="dxa"/>
+              <w:bottom w:w="60" w:type="dxa"/>
+              <w:end w:w="70" w:type="dxa"/>
+            </w:tcMar>
+            <w:vAlign w:val="center"/>
+          </w:tcPr>
+          <w:p>
+            <w:pPr>
+              <w:keepLines/>
+              <w:jc w:val="left"/>
+            </w:pPr>
+            <w:r>
+              <w:rPr>
+                <w:b w:val="0"/>
+                <w:sz w:val="17"/>
+              </w:rPr>
+              <w:t>1.0°</w:t>
+            </w:r>
+          </w:p>
+        </w:tc>
+        <w:tc>
+          <w:tcPr>
+            <w:tcW w:type="dxa" w:w="1655"/>
+            <w:tcMar>
+              <w:top w:w="60" w:type="dxa"/>
+              <w:start w:w="70" w:type="dxa"/>
+              <w:bottom w:w="60" w:type="dxa"/>
+              <w:end w:w="70" w:type="dxa"/>
+            </w:tcMar>
+            <w:vAlign w:val="center"/>
+          </w:tcPr>
+          <w:p>
+            <w:pPr>
+              <w:keepLines/>
+              <w:jc w:val="left"/>
+            </w:pPr>
+            <w:r>
+              <w:rPr>
+                <w:b w:val="0"/>
+                <w:sz w:val="17"/>
               </w:rPr>
               <w:t>0.20 m</w:t>
             </w:r>
@@ -2009,76 +2257,117 @@
         </w:tc>
         <w:tc>
           <w:tcPr>
-            <w:tcW w:type="dxa" w:w="2551"/>
-            <w:tcMar>
-              <w:top w:w="60" w:type="dxa"/>
-              <w:start w:w="70" w:type="dxa"/>
-              <w:bottom w:w="60" w:type="dxa"/>
-              <w:end w:w="70" w:type="dxa"/>
-            </w:tcMar>
-            <w:vAlign w:val="center"/>
-          </w:tcPr>
-          <w:p>
-            <w:pPr>
-              <w:pStyle w:val="MDPI42tablebody"/>
-              <w:jc w:val="left"/>
-              <w:bidi w:val="0"/>
-            </w:pPr>
-            <w:r>
-              <w:rPr>
-                <w:sz w:val="14"/>
+            <w:tcW w:type="dxa" w:w="1512"/>
+            <w:tcMar>
+              <w:top w:w="60" w:type="dxa"/>
+              <w:start w:w="70" w:type="dxa"/>
+              <w:bottom w:w="60" w:type="dxa"/>
+              <w:end w:w="70" w:type="dxa"/>
+            </w:tcMar>
+            <w:vAlign w:val="center"/>
+          </w:tcPr>
+          <w:p>
+            <w:pPr>
+              <w:keepLines/>
+              <w:jc w:val="left"/>
+            </w:pPr>
+            <w:r>
+              <w:rPr>
+                <w:b w:val="0"/>
+                <w:sz w:val="17"/>
               </w:rPr>
               <w:t>339</w:t>
+            </w:r>
+          </w:p>
+        </w:tc>
+        <w:tc>
+          <w:tcPr>
+            <w:tcW w:type="dxa" w:w="2232"/>
+            <w:vAlign w:val="center"/>
+          </w:tcPr>
+          <w:p>
+            <w:pPr>
+              <w:keepLines/>
+              <w:jc w:val="left"/>
+            </w:pPr>
+            <w:r>
+              <w:rPr>
+                <w:b w:val="0"/>
+                <w:sz w:val="17"/>
+              </w:rPr>
+              <w:t>14.264</w:t>
+            </w:r>
+          </w:p>
+        </w:tc>
+        <w:tc>
+          <w:tcPr>
+            <w:tcW w:type="dxa" w:w="1512"/>
+            <w:vAlign w:val="center"/>
+          </w:tcPr>
+          <w:p>
+            <w:pPr>
+              <w:keepLines/>
+              <w:jc w:val="left"/>
+            </w:pPr>
+            <w:r>
+              <w:rPr>
+                <w:b w:val="0"/>
+                <w:sz w:val="17"/>
+              </w:rPr>
+              <w:t>0.631</w:t>
             </w:r>
           </w:p>
         </w:tc>
       </w:tr>
       <w:tr>
-        <w:tc>
-          <w:tcPr>
-            <w:tcW w:type="dxa" w:w="3118"/>
-            <w:tcMar>
-              <w:top w:w="60" w:type="dxa"/>
-              <w:start w:w="70" w:type="dxa"/>
-              <w:bottom w:w="60" w:type="dxa"/>
-              <w:end w:w="70" w:type="dxa"/>
-            </w:tcMar>
-            <w:vAlign w:val="center"/>
-          </w:tcPr>
-          <w:p>
-            <w:pPr>
-              <w:pStyle w:val="MDPI42tablebody"/>
-              <w:jc w:val="left"/>
-              <w:bidi w:val="0"/>
-            </w:pPr>
-            <w:r>
-              <w:rPr>
-                <w:sz w:val="14"/>
-              </w:rPr>
-              <w:t>2.0 degree</w:t>
-            </w:r>
-          </w:p>
-        </w:tc>
-        <w:tc>
-          <w:tcPr>
-            <w:tcW w:type="dxa" w:w="3118"/>
-            <w:tcMar>
-              <w:top w:w="60" w:type="dxa"/>
-              <w:start w:w="70" w:type="dxa"/>
-              <w:bottom w:w="60" w:type="dxa"/>
-              <w:end w:w="70" w:type="dxa"/>
-            </w:tcMar>
-            <w:vAlign w:val="center"/>
-          </w:tcPr>
-          <w:p>
-            <w:pPr>
-              <w:pStyle w:val="MDPI42tablebody"/>
-              <w:jc w:val="left"/>
-              <w:bidi w:val="0"/>
-            </w:pPr>
-            <w:r>
-              <w:rPr>
-                <w:sz w:val="14"/>
+        <w:trPr>
+          <w:cantSplit/>
+        </w:trPr>
+        <w:tc>
+          <w:tcPr>
+            <w:tcW w:type="dxa" w:w="1512"/>
+            <w:tcMar>
+              <w:top w:w="60" w:type="dxa"/>
+              <w:start w:w="70" w:type="dxa"/>
+              <w:bottom w:w="60" w:type="dxa"/>
+              <w:end w:w="70" w:type="dxa"/>
+            </w:tcMar>
+            <w:vAlign w:val="center"/>
+          </w:tcPr>
+          <w:p>
+            <w:pPr>
+              <w:keepLines/>
+              <w:jc w:val="left"/>
+            </w:pPr>
+            <w:r>
+              <w:rPr>
+                <w:b w:val="0"/>
+                <w:sz w:val="17"/>
+              </w:rPr>
+              <w:t>2.0°</w:t>
+            </w:r>
+          </w:p>
+        </w:tc>
+        <w:tc>
+          <w:tcPr>
+            <w:tcW w:type="dxa" w:w="1655"/>
+            <w:tcMar>
+              <w:top w:w="60" w:type="dxa"/>
+              <w:start w:w="70" w:type="dxa"/>
+              <w:bottom w:w="60" w:type="dxa"/>
+              <w:end w:w="70" w:type="dxa"/>
+            </w:tcMar>
+            <w:vAlign w:val="center"/>
+          </w:tcPr>
+          <w:p>
+            <w:pPr>
+              <w:keepLines/>
+              <w:jc w:val="left"/>
+            </w:pPr>
+            <w:r>
+              <w:rPr>
+                <w:b w:val="0"/>
+                <w:sz w:val="17"/>
               </w:rPr>
               <w:t>0.10 m</w:t>
             </w:r>
@@ -2086,76 +2375,117 @@
         </w:tc>
         <w:tc>
           <w:tcPr>
-            <w:tcW w:type="dxa" w:w="2551"/>
-            <w:tcMar>
-              <w:top w:w="60" w:type="dxa"/>
-              <w:start w:w="70" w:type="dxa"/>
-              <w:bottom w:w="60" w:type="dxa"/>
-              <w:end w:w="70" w:type="dxa"/>
-            </w:tcMar>
-            <w:vAlign w:val="center"/>
-          </w:tcPr>
-          <w:p>
-            <w:pPr>
-              <w:pStyle w:val="MDPI42tablebody"/>
-              <w:jc w:val="left"/>
-              <w:bidi w:val="0"/>
-            </w:pPr>
-            <w:r>
-              <w:rPr>
-                <w:sz w:val="14"/>
+            <w:tcW w:type="dxa" w:w="1512"/>
+            <w:tcMar>
+              <w:top w:w="60" w:type="dxa"/>
+              <w:start w:w="70" w:type="dxa"/>
+              <w:bottom w:w="60" w:type="dxa"/>
+              <w:end w:w="70" w:type="dxa"/>
+            </w:tcMar>
+            <w:vAlign w:val="center"/>
+          </w:tcPr>
+          <w:p>
+            <w:pPr>
+              <w:keepLines/>
+              <w:jc w:val="left"/>
+            </w:pPr>
+            <w:r>
+              <w:rPr>
+                <w:b w:val="0"/>
+                <w:sz w:val="17"/>
               </w:rPr>
               <w:t>338</w:t>
+            </w:r>
+          </w:p>
+        </w:tc>
+        <w:tc>
+          <w:tcPr>
+            <w:tcW w:type="dxa" w:w="2232"/>
+            <w:vAlign w:val="center"/>
+          </w:tcPr>
+          <w:p>
+            <w:pPr>
+              <w:keepLines/>
+              <w:jc w:val="left"/>
+            </w:pPr>
+            <w:r>
+              <w:rPr>
+                <w:b w:val="0"/>
+                <w:sz w:val="17"/>
+              </w:rPr>
+              <w:t>14.232</w:t>
+            </w:r>
+          </w:p>
+        </w:tc>
+        <w:tc>
+          <w:tcPr>
+            <w:tcW w:type="dxa" w:w="1512"/>
+            <w:vAlign w:val="center"/>
+          </w:tcPr>
+          <w:p>
+            <w:pPr>
+              <w:keepLines/>
+              <w:jc w:val="left"/>
+            </w:pPr>
+            <w:r>
+              <w:rPr>
+                <w:b w:val="0"/>
+                <w:sz w:val="17"/>
+              </w:rPr>
+              <w:t>0.631</w:t>
             </w:r>
           </w:p>
         </w:tc>
       </w:tr>
       <w:tr>
-        <w:tc>
-          <w:tcPr>
-            <w:tcW w:type="dxa" w:w="3118"/>
-            <w:tcMar>
-              <w:top w:w="60" w:type="dxa"/>
-              <w:start w:w="70" w:type="dxa"/>
-              <w:bottom w:w="60" w:type="dxa"/>
-              <w:end w:w="70" w:type="dxa"/>
-            </w:tcMar>
-            <w:vAlign w:val="center"/>
-          </w:tcPr>
-          <w:p>
-            <w:pPr>
-              <w:pStyle w:val="MDPI42tablebody"/>
-              <w:jc w:val="left"/>
-              <w:bidi w:val="0"/>
-            </w:pPr>
-            <w:r>
-              <w:rPr>
-                <w:sz w:val="14"/>
-              </w:rPr>
-              <w:t>2.0 degree</w:t>
-            </w:r>
-          </w:p>
-        </w:tc>
-        <w:tc>
-          <w:tcPr>
-            <w:tcW w:type="dxa" w:w="3118"/>
-            <w:tcMar>
-              <w:top w:w="60" w:type="dxa"/>
-              <w:start w:w="70" w:type="dxa"/>
-              <w:bottom w:w="60" w:type="dxa"/>
-              <w:end w:w="70" w:type="dxa"/>
-            </w:tcMar>
-            <w:vAlign w:val="center"/>
-          </w:tcPr>
-          <w:p>
-            <w:pPr>
-              <w:pStyle w:val="MDPI42tablebody"/>
-              <w:jc w:val="left"/>
-              <w:bidi w:val="0"/>
-            </w:pPr>
-            <w:r>
-              <w:rPr>
-                <w:sz w:val="14"/>
+        <w:trPr>
+          <w:cantSplit/>
+        </w:trPr>
+        <w:tc>
+          <w:tcPr>
+            <w:tcW w:type="dxa" w:w="1512"/>
+            <w:tcMar>
+              <w:top w:w="60" w:type="dxa"/>
+              <w:start w:w="70" w:type="dxa"/>
+              <w:bottom w:w="60" w:type="dxa"/>
+              <w:end w:w="70" w:type="dxa"/>
+            </w:tcMar>
+            <w:vAlign w:val="center"/>
+          </w:tcPr>
+          <w:p>
+            <w:pPr>
+              <w:keepLines/>
+              <w:jc w:val="left"/>
+            </w:pPr>
+            <w:r>
+              <w:rPr>
+                <w:b w:val="0"/>
+                <w:sz w:val="17"/>
+              </w:rPr>
+              <w:t>2.0°</w:t>
+            </w:r>
+          </w:p>
+        </w:tc>
+        <w:tc>
+          <w:tcPr>
+            <w:tcW w:type="dxa" w:w="1655"/>
+            <w:tcMar>
+              <w:top w:w="60" w:type="dxa"/>
+              <w:start w:w="70" w:type="dxa"/>
+              <w:bottom w:w="60" w:type="dxa"/>
+              <w:end w:w="70" w:type="dxa"/>
+            </w:tcMar>
+            <w:vAlign w:val="center"/>
+          </w:tcPr>
+          <w:p>
+            <w:pPr>
+              <w:keepLines/>
+              <w:jc w:val="left"/>
+            </w:pPr>
+            <w:r>
+              <w:rPr>
+                <w:b w:val="0"/>
+                <w:sz w:val="17"/>
               </w:rPr>
               <w:t>0.20 m</w:t>
             </w:r>
@@ -2163,26 +2493,64 @@
         </w:tc>
         <w:tc>
           <w:tcPr>
-            <w:tcW w:type="dxa" w:w="2551"/>
-            <w:tcMar>
-              <w:top w:w="60" w:type="dxa"/>
-              <w:start w:w="70" w:type="dxa"/>
-              <w:bottom w:w="60" w:type="dxa"/>
-              <w:end w:w="70" w:type="dxa"/>
-            </w:tcMar>
-            <w:vAlign w:val="center"/>
-          </w:tcPr>
-          <w:p>
-            <w:pPr>
-              <w:pStyle w:val="MDPI42tablebody"/>
-              <w:jc w:val="left"/>
-              <w:bidi w:val="0"/>
-            </w:pPr>
-            <w:r>
-              <w:rPr>
-                <w:sz w:val="14"/>
+            <w:tcW w:type="dxa" w:w="1512"/>
+            <w:tcMar>
+              <w:top w:w="60" w:type="dxa"/>
+              <w:start w:w="70" w:type="dxa"/>
+              <w:bottom w:w="60" w:type="dxa"/>
+              <w:end w:w="70" w:type="dxa"/>
+            </w:tcMar>
+            <w:vAlign w:val="center"/>
+          </w:tcPr>
+          <w:p>
+            <w:pPr>
+              <w:keepLines/>
+              <w:jc w:val="left"/>
+            </w:pPr>
+            <w:r>
+              <w:rPr>
+                <w:b w:val="0"/>
+                <w:sz w:val="17"/>
               </w:rPr>
               <w:t>337</w:t>
+            </w:r>
+          </w:p>
+        </w:tc>
+        <w:tc>
+          <w:tcPr>
+            <w:tcW w:type="dxa" w:w="2232"/>
+            <w:vAlign w:val="center"/>
+          </w:tcPr>
+          <w:p>
+            <w:pPr>
+              <w:keepLines/>
+              <w:jc w:val="left"/>
+            </w:pPr>
+            <w:r>
+              <w:rPr>
+                <w:b w:val="0"/>
+                <w:sz w:val="17"/>
+              </w:rPr>
+              <w:t>14.231</w:t>
+            </w:r>
+          </w:p>
+        </w:tc>
+        <w:tc>
+          <w:tcPr>
+            <w:tcW w:type="dxa" w:w="1512"/>
+            <w:vAlign w:val="center"/>
+          </w:tcPr>
+          <w:p>
+            <w:pPr>
+              <w:keepLines/>
+              <w:jc w:val="left"/>
+            </w:pPr>
+            <w:r>
+              <w:rPr>
+                <w:b w:val="0"/>
+                <w:sz w:val="17"/>
+              </w:rPr>
+              <w:t>0.631</w:t>
             </w:r>
           </w:p>
         </w:tc>
@@ -2219,6 +2587,7 @@
       <w:tr>
         <w:trPr>
           <w:tblHeader w:val="true"/>
+          <w:cantSplit/>
         </w:trPr>
         <w:tc>
           <w:tcPr>
@@ -2235,8 +2604,8 @@
           <w:p>
             <w:pPr>
               <w:pStyle w:val="MDPI42tablebody"/>
-              <w:jc w:val="left"/>
-              <w:bidi w:val="0"/>
+              <w:keepLines/>
+              <w:jc w:val="left"/>
             </w:pPr>
             <w:r>
               <w:rPr>
@@ -2262,8 +2631,8 @@
           <w:p>
             <w:pPr>
               <w:pStyle w:val="MDPI42tablebody"/>
-              <w:jc w:val="left"/>
-              <w:bidi w:val="0"/>
+              <w:keepLines/>
+              <w:jc w:val="left"/>
             </w:pPr>
             <w:r>
               <w:rPr>
@@ -2276,6 +2645,9 @@
         </w:tc>
       </w:tr>
       <w:tr>
+        <w:trPr>
+          <w:cantSplit/>
+        </w:trPr>
         <w:tc>
           <w:tcPr>
             <w:tcW w:type="dxa" w:w="3402"/>
@@ -2290,8 +2662,8 @@
           <w:p>
             <w:pPr>
               <w:pStyle w:val="MDPI42tablebody"/>
-              <w:jc w:val="left"/>
-              <w:bidi w:val="0"/>
+              <w:keepLines/>
+              <w:jc w:val="left"/>
             </w:pPr>
             <w:r>
               <w:rPr>
@@ -2315,8 +2687,8 @@
           <w:p>
             <w:pPr>
               <w:pStyle w:val="MDPI42tablebody"/>
-              <w:jc w:val="left"/>
-              <w:bidi w:val="0"/>
+              <w:keepLines/>
+              <w:jc w:val="left"/>
             </w:pPr>
             <w:r>
               <w:rPr>
@@ -2328,6 +2700,9 @@
         </w:tc>
       </w:tr>
       <w:tr>
+        <w:trPr>
+          <w:cantSplit/>
+        </w:trPr>
         <w:tc>
           <w:tcPr>
             <w:tcW w:type="dxa" w:w="3402"/>
@@ -2342,8 +2717,8 @@
           <w:p>
             <w:pPr>
               <w:pStyle w:val="MDPI42tablebody"/>
-              <w:jc w:val="left"/>
-              <w:bidi w:val="0"/>
+              <w:keepLines/>
+              <w:jc w:val="left"/>
             </w:pPr>
             <w:r>
               <w:rPr>
@@ -2367,8 +2742,8 @@
           <w:p>
             <w:pPr>
               <w:pStyle w:val="MDPI42tablebody"/>
-              <w:jc w:val="left"/>
-              <w:bidi w:val="0"/>
+              <w:keepLines/>
+              <w:jc w:val="left"/>
             </w:pPr>
             <w:r>
               <w:rPr>
@@ -2380,6 +2755,9 @@
         </w:tc>
       </w:tr>
       <w:tr>
+        <w:trPr>
+          <w:cantSplit/>
+        </w:trPr>
         <w:tc>
           <w:tcPr>
             <w:tcW w:type="dxa" w:w="3402"/>
@@ -2394,8 +2772,8 @@
           <w:p>
             <w:pPr>
               <w:pStyle w:val="MDPI42tablebody"/>
-              <w:jc w:val="left"/>
-              <w:bidi w:val="0"/>
+              <w:keepLines/>
+              <w:jc w:val="left"/>
             </w:pPr>
             <w:r>
               <w:rPr>
@@ -2419,8 +2797,8 @@
           <w:p>
             <w:pPr>
               <w:pStyle w:val="MDPI42tablebody"/>
-              <w:jc w:val="left"/>
-              <w:bidi w:val="0"/>
+              <w:keepLines/>
+              <w:jc w:val="left"/>
             </w:pPr>
             <w:r>
               <w:rPr>
@@ -2432,6 +2810,9 @@
         </w:tc>
       </w:tr>
       <w:tr>
+        <w:trPr>
+          <w:cantSplit/>
+        </w:trPr>
         <w:tc>
           <w:tcPr>
             <w:tcW w:type="dxa" w:w="3402"/>
@@ -2446,8 +2827,8 @@
           <w:p>
             <w:pPr>
               <w:pStyle w:val="MDPI42tablebody"/>
-              <w:jc w:val="left"/>
-              <w:bidi w:val="0"/>
+              <w:keepLines/>
+              <w:jc w:val="left"/>
             </w:pPr>
             <w:r>
               <w:rPr>
@@ -2471,8 +2852,8 @@
           <w:p>
             <w:pPr>
               <w:pStyle w:val="MDPI42tablebody"/>
-              <w:jc w:val="left"/>
-              <w:bidi w:val="0"/>
+              <w:keepLines/>
+              <w:jc w:val="left"/>
             </w:pPr>
             <w:r>
               <w:rPr>
@@ -2484,6 +2865,9 @@
         </w:tc>
       </w:tr>
       <w:tr>
+        <w:trPr>
+          <w:cantSplit/>
+        </w:trPr>
         <w:tc>
           <w:tcPr>
             <w:tcW w:type="dxa" w:w="3402"/>
@@ -2498,8 +2882,8 @@
           <w:p>
             <w:pPr>
               <w:pStyle w:val="MDPI42tablebody"/>
-              <w:jc w:val="left"/>
-              <w:bidi w:val="0"/>
+              <w:keepLines/>
+              <w:jc w:val="left"/>
             </w:pPr>
             <w:r>
               <w:rPr>
@@ -2523,8 +2907,8 @@
           <w:p>
             <w:pPr>
               <w:pStyle w:val="MDPI42tablebody"/>
-              <w:jc w:val="left"/>
-              <w:bidi w:val="0"/>
+              <w:keepLines/>
+              <w:jc w:val="left"/>
             </w:pPr>
             <w:r>
               <w:rPr>
@@ -2536,6 +2920,9 @@
         </w:tc>
       </w:tr>
       <w:tr>
+        <w:trPr>
+          <w:cantSplit/>
+        </w:trPr>
         <w:tc>
           <w:tcPr>
             <w:tcW w:type="dxa" w:w="3402"/>
@@ -2550,8 +2937,8 @@
           <w:p>
             <w:pPr>
               <w:pStyle w:val="MDPI42tablebody"/>
-              <w:jc w:val="left"/>
-              <w:bidi w:val="0"/>
+              <w:keepLines/>
+              <w:jc w:val="left"/>
             </w:pPr>
             <w:r>
               <w:rPr>
@@ -2575,8 +2962,8 @@
           <w:p>
             <w:pPr>
               <w:pStyle w:val="MDPI42tablebody"/>
-              <w:jc w:val="left"/>
-              <w:bidi w:val="0"/>
+              <w:keepLines/>
+              <w:jc w:val="left"/>
             </w:pPr>
             <w:r>
               <w:rPr>
@@ -2588,6 +2975,9 @@
         </w:tc>
       </w:tr>
       <w:tr>
+        <w:trPr>
+          <w:cantSplit/>
+        </w:trPr>
         <w:tc>
           <w:tcPr>
             <w:tcW w:type="dxa" w:w="3402"/>
@@ -2602,8 +2992,8 @@
           <w:p>
             <w:pPr>
               <w:pStyle w:val="MDPI42tablebody"/>
-              <w:jc w:val="left"/>
-              <w:bidi w:val="0"/>
+              <w:keepLines/>
+              <w:jc w:val="left"/>
             </w:pPr>
             <w:r>
               <w:rPr>
@@ -2627,8 +3017,8 @@
           <w:p>
             <w:pPr>
               <w:pStyle w:val="MDPI42tablebody"/>
-              <w:jc w:val="left"/>
-              <w:bidi w:val="0"/>
+              <w:keepLines/>
+              <w:jc w:val="left"/>
             </w:pPr>
             <w:r>
               <w:rPr>
@@ -2640,6 +3030,9 @@
         </w:tc>
       </w:tr>
       <w:tr>
+        <w:trPr>
+          <w:cantSplit/>
+        </w:trPr>
         <w:tc>
           <w:tcPr>
             <w:tcW w:type="dxa" w:w="3402"/>
@@ -2654,8 +3047,8 @@
           <w:p>
             <w:pPr>
               <w:pStyle w:val="MDPI42tablebody"/>
-              <w:jc w:val="left"/>
-              <w:bidi w:val="0"/>
+              <w:keepLines/>
+              <w:jc w:val="left"/>
             </w:pPr>
             <w:r>
               <w:rPr>
@@ -2679,8 +3072,8 @@
           <w:p>
             <w:pPr>
               <w:pStyle w:val="MDPI42tablebody"/>
-              <w:jc w:val="left"/>
-              <w:bidi w:val="0"/>
+              <w:keepLines/>
+              <w:jc w:val="left"/>
             </w:pPr>
             <w:r>
               <w:rPr>
@@ -2692,6 +3085,9 @@
         </w:tc>
       </w:tr>
       <w:tr>
+        <w:trPr>
+          <w:cantSplit/>
+        </w:trPr>
         <w:tc>
           <w:tcPr>
             <w:tcW w:type="dxa" w:w="3402"/>
@@ -2706,8 +3102,8 @@
           <w:p>
             <w:pPr>
               <w:pStyle w:val="MDPI42tablebody"/>
-              <w:jc w:val="left"/>
-              <w:bidi w:val="0"/>
+              <w:keepLines/>
+              <w:jc w:val="left"/>
             </w:pPr>
             <w:r>
               <w:rPr>
@@ -2731,8 +3127,8 @@
           <w:p>
             <w:pPr>
               <w:pStyle w:val="MDPI42tablebody"/>
-              <w:jc w:val="left"/>
-              <w:bidi w:val="0"/>
+              <w:keepLines/>
+              <w:jc w:val="left"/>
             </w:pPr>
             <w:r>
               <w:rPr>
@@ -2744,6 +3140,9 @@
         </w:tc>
       </w:tr>
       <w:tr>
+        <w:trPr>
+          <w:cantSplit/>
+        </w:trPr>
         <w:tc>
           <w:tcPr>
             <w:tcW w:type="dxa" w:w="3402"/>
@@ -2758,8 +3157,8 @@
           <w:p>
             <w:pPr>
               <w:pStyle w:val="MDPI42tablebody"/>
-              <w:jc w:val="left"/>
-              <w:bidi w:val="0"/>
+              <w:keepLines/>
+              <w:jc w:val="left"/>
             </w:pPr>
             <w:r>
               <w:rPr>
@@ -2783,8 +3182,8 @@
           <w:p>
             <w:pPr>
               <w:pStyle w:val="MDPI42tablebody"/>
-              <w:jc w:val="left"/>
-              <w:bidi w:val="0"/>
+              <w:keepLines/>
+              <w:jc w:val="left"/>
             </w:pPr>
             <w:r>
               <w:rPr>
@@ -2796,6 +3195,9 @@
         </w:tc>
       </w:tr>
       <w:tr>
+        <w:trPr>
+          <w:cantSplit/>
+        </w:trPr>
         <w:tc>
           <w:tcPr>
             <w:tcW w:type="dxa" w:w="3402"/>
@@ -2810,8 +3212,8 @@
           <w:p>
             <w:pPr>
               <w:pStyle w:val="MDPI42tablebody"/>
-              <w:jc w:val="left"/>
-              <w:bidi w:val="0"/>
+              <w:keepLines/>
+              <w:jc w:val="left"/>
             </w:pPr>
             <w:r>
               <w:rPr>
@@ -2835,8 +3237,8 @@
           <w:p>
             <w:pPr>
               <w:pStyle w:val="MDPI42tablebody"/>
-              <w:jc w:val="left"/>
-              <w:bidi w:val="0"/>
+              <w:keepLines/>
+              <w:jc w:val="left"/>
             </w:pPr>
             <w:r>
               <w:rPr>
@@ -2848,6 +3250,9 @@
         </w:tc>
       </w:tr>
       <w:tr>
+        <w:trPr>
+          <w:cantSplit/>
+        </w:trPr>
         <w:tc>
           <w:tcPr>
             <w:tcW w:type="dxa" w:w="3402"/>
@@ -2862,8 +3267,8 @@
           <w:p>
             <w:pPr>
               <w:pStyle w:val="MDPI42tablebody"/>
-              <w:jc w:val="left"/>
-              <w:bidi w:val="0"/>
+              <w:keepLines/>
+              <w:jc w:val="left"/>
             </w:pPr>
             <w:r>
               <w:rPr>
@@ -2887,8 +3292,8 @@
           <w:p>
             <w:pPr>
               <w:pStyle w:val="MDPI42tablebody"/>
-              <w:jc w:val="left"/>
-              <w:bidi w:val="0"/>
+              <w:keepLines/>
+              <w:jc w:val="left"/>
             </w:pPr>
             <w:r>
               <w:rPr>
@@ -2905,7 +3310,7 @@
         <w:pStyle w:val="MDPI31text"/>
       </w:pPr>
       <w:r>
-        <w:t>Across all controlled realizations, internal-boundary density showed the strongest monotonic association with incremental loss (Spearman rho = 0.968), followed by facet count (rho = 0.939). Small-facet area share, facet-area coefficient of variation and mean compactness gave rho values of 0.584, 0.440 and -0.621, respectively.</w:t>
+        <w:t>Across all controlled realizations, internal-boundary density showed the strongest monotonic association with incremental loss (Spearman ρ = 0.968), followed by facet count (ρ = 0.939). Small-facet area share, facet-area coefficient of variation and mean compactness gave ρ values of 0.584, 0.440 and −0.621, respectively.</w:t>
       </w:r>
     </w:p>
     <w:p>
@@ -2931,6 +3336,7 @@
       <w:tr>
         <w:trPr>
           <w:tblHeader w:val="true"/>
+          <w:cantSplit/>
         </w:trPr>
         <w:tc>
           <w:tcPr>
@@ -2947,8 +3353,8 @@
           <w:p>
             <w:pPr>
               <w:pStyle w:val="MDPI42tablebody"/>
-              <w:jc w:val="left"/>
-              <w:bidi w:val="0"/>
+              <w:keepLines/>
+              <w:jc w:val="left"/>
             </w:pPr>
             <w:r>
               <w:rPr>
@@ -2974,8 +3380,8 @@
           <w:p>
             <w:pPr>
               <w:pStyle w:val="MDPI42tablebody"/>
-              <w:jc w:val="left"/>
-              <w:bidi w:val="0"/>
+              <w:keepLines/>
+              <w:jc w:val="left"/>
             </w:pPr>
             <w:r>
               <w:rPr>
@@ -2988,6 +3394,9 @@
         </w:tc>
       </w:tr>
       <w:tr>
+        <w:trPr>
+          <w:cantSplit/>
+        </w:trPr>
         <w:tc>
           <w:tcPr>
             <w:tcW w:type="dxa" w:w="3685"/>
@@ -3002,8 +3411,8 @@
           <w:p>
             <w:pPr>
               <w:pStyle w:val="MDPI42tablebody"/>
-              <w:jc w:val="left"/>
-              <w:bidi w:val="0"/>
+              <w:keepLines/>
+              <w:jc w:val="left"/>
             </w:pPr>
             <w:r>
               <w:rPr>
@@ -3027,8 +3436,8 @@
           <w:p>
             <w:pPr>
               <w:pStyle w:val="MDPI42tablebody"/>
-              <w:jc w:val="left"/>
-              <w:bidi w:val="0"/>
+              <w:keepLines/>
+              <w:jc w:val="left"/>
             </w:pPr>
             <w:r>
               <w:rPr>
@@ -3040,6 +3449,9 @@
         </w:tc>
       </w:tr>
       <w:tr>
+        <w:trPr>
+          <w:cantSplit/>
+        </w:trPr>
         <w:tc>
           <w:tcPr>
             <w:tcW w:type="dxa" w:w="3685"/>
@@ -3054,8 +3466,8 @@
           <w:p>
             <w:pPr>
               <w:pStyle w:val="MDPI42tablebody"/>
-              <w:jc w:val="left"/>
-              <w:bidi w:val="0"/>
+              <w:keepLines/>
+              <w:jc w:val="left"/>
             </w:pPr>
             <w:r>
               <w:rPr>
@@ -3078,20 +3490,22 @@
           </w:tcPr>
           <w:p>
             <w:pPr>
-              <w:pStyle w:val="MDPI42tablebody"/>
-              <w:jc w:val="left"/>
-              <w:bidi w:val="0"/>
-            </w:pPr>
-            <w:r>
-              <w:rPr>
-                <w:sz w:val="14"/>
-              </w:rPr>
-              <w:t>1.96-2,896.88 m2</w:t>
+              <w:keepLines/>
+              <w:jc w:val="left"/>
+            </w:pPr>
+            <w:r>
+              <w:rPr>
+                <w:b w:val="0"/>
+              </w:rPr>
+              <w:t>1.96–2,896.88 m²</w:t>
             </w:r>
           </w:p>
         </w:tc>
       </w:tr>
       <w:tr>
+        <w:trPr>
+          <w:cantSplit/>
+        </w:trPr>
         <w:tc>
           <w:tcPr>
             <w:tcW w:type="dxa" w:w="3685"/>
@@ -3106,8 +3520,8 @@
           <w:p>
             <w:pPr>
               <w:pStyle w:val="MDPI42tablebody"/>
-              <w:jc w:val="left"/>
-              <w:bidi w:val="0"/>
+              <w:keepLines/>
+              <w:jc w:val="left"/>
             </w:pPr>
             <w:r>
               <w:rPr>
@@ -3130,20 +3544,22 @@
           </w:tcPr>
           <w:p>
             <w:pPr>
-              <w:pStyle w:val="MDPI42tablebody"/>
-              <w:jc w:val="left"/>
-              <w:bidi w:val="0"/>
-            </w:pPr>
-            <w:r>
-              <w:rPr>
-                <w:sz w:val="14"/>
-              </w:rPr>
-              <w:t>Edge-derived orientations; 9 x 9 offsets; 10 mm clearance</w:t>
+              <w:keepLines/>
+              <w:jc w:val="left"/>
+            </w:pPr>
+            <w:r>
+              <w:rPr>
+                <w:b w:val="0"/>
+              </w:rPr>
+              <w:t>Edge-derived orientations; 9 × 9 offsets; 10 mm clearance</w:t>
             </w:r>
           </w:p>
         </w:tc>
       </w:tr>
       <w:tr>
+        <w:trPr>
+          <w:cantSplit/>
+        </w:trPr>
         <w:tc>
           <w:tcPr>
             <w:tcW w:type="dxa" w:w="3685"/>
@@ -3158,8 +3574,8 @@
           <w:p>
             <w:pPr>
               <w:pStyle w:val="MDPI42tablebody"/>
-              <w:jc w:val="left"/>
-              <w:bidi w:val="0"/>
+              <w:keepLines/>
+              <w:jc w:val="left"/>
             </w:pPr>
             <w:r>
               <w:rPr>
@@ -3182,20 +3598,22 @@
           </w:tcPr>
           <w:p>
             <w:pPr>
-              <w:pStyle w:val="MDPI42tablebody"/>
-              <w:jc w:val="left"/>
-              <w:bidi w:val="0"/>
-            </w:pPr>
-            <w:r>
-              <w:rPr>
-                <w:sz w:val="14"/>
-              </w:rPr>
-              <w:t>Production angles plus +/-2.5 degree perturbations; 11 x 11 offsets</w:t>
+              <w:keepLines/>
+              <w:jc w:val="left"/>
+            </w:pPr>
+            <w:r>
+              <w:rPr>
+                <w:b w:val="0"/>
+              </w:rPr>
+              <w:t>Production angles plus ±2.5° perturbations; 11 × 11 offsets</w:t>
             </w:r>
           </w:p>
         </w:tc>
       </w:tr>
       <w:tr>
+        <w:trPr>
+          <w:cantSplit/>
+        </w:trPr>
         <w:tc>
           <w:tcPr>
             <w:tcW w:type="dxa" w:w="3685"/>
@@ -3210,8 +3628,8 @@
           <w:p>
             <w:pPr>
               <w:pStyle w:val="MDPI42tablebody"/>
-              <w:jc w:val="left"/>
-              <w:bidi w:val="0"/>
+              <w:keepLines/>
+              <w:jc w:val="left"/>
             </w:pPr>
             <w:r>
               <w:rPr>
@@ -3235,8 +3653,8 @@
           <w:p>
             <w:pPr>
               <w:pStyle w:val="MDPI42tablebody"/>
-              <w:jc w:val="left"/>
-              <w:bidi w:val="0"/>
+              <w:keepLines/>
+              <w:jc w:val="left"/>
             </w:pPr>
             <w:r>
               <w:rPr>
@@ -3248,6 +3666,9 @@
         </w:tc>
       </w:tr>
       <w:tr>
+        <w:trPr>
+          <w:cantSplit/>
+        </w:trPr>
         <w:tc>
           <w:tcPr>
             <w:tcW w:type="dxa" w:w="3685"/>
@@ -3262,8 +3683,8 @@
           <w:p>
             <w:pPr>
               <w:pStyle w:val="MDPI42tablebody"/>
-              <w:jc w:val="left"/>
-              <w:bidi w:val="0"/>
+              <w:keepLines/>
+              <w:jc w:val="left"/>
             </w:pPr>
             <w:r>
               <w:rPr>
@@ -3287,8 +3708,8 @@
           <w:p>
             <w:pPr>
               <w:pStyle w:val="MDPI42tablebody"/>
-              <w:jc w:val="left"/>
-              <w:bidi w:val="0"/>
+              <w:keepLines/>
+              <w:jc w:val="left"/>
             </w:pPr>
             <w:r>
               <w:rPr>
@@ -3300,6 +3721,9 @@
         </w:tc>
       </w:tr>
       <w:tr>
+        <w:trPr>
+          <w:cantSplit/>
+        </w:trPr>
         <w:tc>
           <w:tcPr>
             <w:tcW w:type="dxa" w:w="3685"/>
@@ -3314,8 +3738,8 @@
           <w:p>
             <w:pPr>
               <w:pStyle w:val="MDPI42tablebody"/>
-              <w:jc w:val="left"/>
-              <w:bidi w:val="0"/>
+              <w:keepLines/>
+              <w:jc w:val="left"/>
             </w:pPr>
             <w:r>
               <w:rPr>
@@ -3339,8 +3763,8 @@
           <w:p>
             <w:pPr>
               <w:pStyle w:val="MDPI42tablebody"/>
-              <w:jc w:val="left"/>
-              <w:bidi w:val="0"/>
+              <w:keepLines/>
+              <w:jc w:val="left"/>
             </w:pPr>
             <w:r>
               <w:rPr>
@@ -3352,6 +3776,9 @@
         </w:tc>
       </w:tr>
       <w:tr>
+        <w:trPr>
+          <w:cantSplit/>
+        </w:trPr>
         <w:tc>
           <w:tcPr>
             <w:tcW w:type="dxa" w:w="3685"/>
@@ -3366,8 +3793,8 @@
           <w:p>
             <w:pPr>
               <w:pStyle w:val="MDPI42tablebody"/>
-              <w:jc w:val="left"/>
-              <w:bidi w:val="0"/>
+              <w:keepLines/>
+              <w:jc w:val="left"/>
             </w:pPr>
             <w:r>
               <w:rPr>
@@ -3390,15 +3817,14 @@
           </w:tcPr>
           <w:p>
             <w:pPr>
-              <w:pStyle w:val="MDPI42tablebody"/>
-              <w:jc w:val="left"/>
-              <w:bidi w:val="0"/>
-            </w:pPr>
-            <w:r>
-              <w:rPr>
-                <w:sz w:val="14"/>
-              </w:rPr>
-              <w:t>2,896.88 m2; no count difference</w:t>
+              <w:keepLines/>
+              <w:jc w:val="left"/>
+            </w:pPr>
+            <w:r>
+              <w:rPr>
+                <w:b w:val="0"/>
+              </w:rPr>
+              <w:t>2,896.88 m²; no count difference</w:t>
             </w:r>
           </w:p>
         </w:tc>
@@ -3427,6 +3853,7 @@
       <w:tr>
         <w:trPr>
           <w:tblHeader w:val="true"/>
+          <w:cantSplit/>
         </w:trPr>
         <w:tc>
           <w:tcPr>
@@ -3443,8 +3870,8 @@
           <w:p>
             <w:pPr>
               <w:pStyle w:val="MDPI42tablebody"/>
-              <w:jc w:val="left"/>
-              <w:bidi w:val="0"/>
+              <w:keepLines/>
+              <w:jc w:val="left"/>
             </w:pPr>
             <w:r>
               <w:rPr>
@@ -3470,8 +3897,8 @@
           <w:p>
             <w:pPr>
               <w:pStyle w:val="MDPI42tablebody"/>
-              <w:jc w:val="left"/>
-              <w:bidi w:val="0"/>
+              <w:keepLines/>
+              <w:jc w:val="left"/>
             </w:pPr>
             <w:r>
               <w:rPr>
@@ -3484,6 +3911,9 @@
         </w:tc>
       </w:tr>
       <w:tr>
+        <w:trPr>
+          <w:cantSplit/>
+        </w:trPr>
         <w:tc>
           <w:tcPr>
             <w:tcW w:type="dxa" w:w="3742"/>
@@ -3498,8 +3928,8 @@
           <w:p>
             <w:pPr>
               <w:pStyle w:val="MDPI42tablebody"/>
-              <w:jc w:val="left"/>
-              <w:bidi w:val="0"/>
+              <w:keepLines/>
+              <w:jc w:val="left"/>
             </w:pPr>
             <w:r>
               <w:rPr>
@@ -3523,8 +3953,8 @@
           <w:p>
             <w:pPr>
               <w:pStyle w:val="MDPI42tablebody"/>
-              <w:jc w:val="left"/>
-              <w:bidi w:val="0"/>
+              <w:keepLines/>
+              <w:jc w:val="left"/>
             </w:pPr>
             <w:r>
               <w:rPr>
@@ -3536,6 +3966,9 @@
         </w:tc>
       </w:tr>
       <w:tr>
+        <w:trPr>
+          <w:cantSplit/>
+        </w:trPr>
         <w:tc>
           <w:tcPr>
             <w:tcW w:type="dxa" w:w="3742"/>
@@ -3550,8 +3983,8 @@
           <w:p>
             <w:pPr>
               <w:pStyle w:val="MDPI42tablebody"/>
-              <w:jc w:val="left"/>
-              <w:bidi w:val="0"/>
+              <w:keepLines/>
+              <w:jc w:val="left"/>
             </w:pPr>
             <w:r>
               <w:rPr>
@@ -3575,8 +4008,8 @@
           <w:p>
             <w:pPr>
               <w:pStyle w:val="MDPI42tablebody"/>
-              <w:jc w:val="left"/>
-              <w:bidi w:val="0"/>
+              <w:keepLines/>
+              <w:jc w:val="left"/>
             </w:pPr>
             <w:r>
               <w:rPr>
@@ -3588,6 +4021,9 @@
         </w:tc>
       </w:tr>
       <w:tr>
+        <w:trPr>
+          <w:cantSplit/>
+        </w:trPr>
         <w:tc>
           <w:tcPr>
             <w:tcW w:type="dxa" w:w="3742"/>
@@ -3602,8 +4038,8 @@
           <w:p>
             <w:pPr>
               <w:pStyle w:val="MDPI42tablebody"/>
-              <w:jc w:val="left"/>
-              <w:bidi w:val="0"/>
+              <w:keepLines/>
+              <w:jc w:val="left"/>
             </w:pPr>
             <w:r>
               <w:rPr>
@@ -3627,8 +4063,8 @@
           <w:p>
             <w:pPr>
               <w:pStyle w:val="MDPI42tablebody"/>
-              <w:jc w:val="left"/>
-              <w:bidi w:val="0"/>
+              <w:keepLines/>
+              <w:jc w:val="left"/>
             </w:pPr>
             <w:r>
               <w:rPr>
@@ -3640,6 +4076,9 @@
         </w:tc>
       </w:tr>
       <w:tr>
+        <w:trPr>
+          <w:cantSplit/>
+        </w:trPr>
         <w:tc>
           <w:tcPr>
             <w:tcW w:type="dxa" w:w="3742"/>
@@ -3654,8 +4093,8 @@
           <w:p>
             <w:pPr>
               <w:pStyle w:val="MDPI42tablebody"/>
-              <w:jc w:val="left"/>
-              <w:bidi w:val="0"/>
+              <w:keepLines/>
+              <w:jc w:val="left"/>
             </w:pPr>
             <w:r>
               <w:rPr>
@@ -3678,20 +4117,22 @@
           </w:tcPr>
           <w:p>
             <w:pPr>
-              <w:pStyle w:val="MDPI42tablebody"/>
-              <w:jc w:val="left"/>
-              <w:bidi w:val="0"/>
-            </w:pPr>
-            <w:r>
-              <w:rPr>
-                <w:sz w:val="14"/>
-              </w:rPr>
-              <w:t>Near-flat &lt;5 degrees; pitched &gt;=5 degrees</w:t>
+              <w:keepLines/>
+              <w:jc w:val="left"/>
+            </w:pPr>
+            <w:r>
+              <w:rPr>
+                <w:b w:val="0"/>
+              </w:rPr>
+              <w:t>Near-flat &lt;5°; pitched ≥5°</w:t>
             </w:r>
           </w:p>
         </w:tc>
       </w:tr>
       <w:tr>
+        <w:trPr>
+          <w:cantSplit/>
+        </w:trPr>
         <w:tc>
           <w:tcPr>
             <w:tcW w:type="dxa" w:w="3742"/>
@@ -3706,8 +4147,8 @@
           <w:p>
             <w:pPr>
               <w:pStyle w:val="MDPI42tablebody"/>
-              <w:jc w:val="left"/>
-              <w:bidi w:val="0"/>
+              <w:keepLines/>
+              <w:jc w:val="left"/>
             </w:pPr>
             <w:r>
               <w:rPr>
@@ -3731,8 +4172,8 @@
           <w:p>
             <w:pPr>
               <w:pStyle w:val="MDPI42tablebody"/>
-              <w:jc w:val="left"/>
-              <w:bidi w:val="0"/>
+              <w:keepLines/>
+              <w:jc w:val="left"/>
             </w:pPr>
             <w:r>
               <w:rPr>
@@ -3744,6 +4185,9 @@
         </w:tc>
       </w:tr>
       <w:tr>
+        <w:trPr>
+          <w:cantSplit/>
+        </w:trPr>
         <w:tc>
           <w:tcPr>
             <w:tcW w:type="dxa" w:w="3742"/>
@@ -3758,8 +4202,8 @@
           <w:p>
             <w:pPr>
               <w:pStyle w:val="MDPI42tablebody"/>
-              <w:jc w:val="left"/>
-              <w:bidi w:val="0"/>
+              <w:keepLines/>
+              <w:jc w:val="left"/>
             </w:pPr>
             <w:r>
               <w:rPr>
@@ -3782,20 +4226,22 @@
           </w:tcPr>
           <w:p>
             <w:pPr>
-              <w:pStyle w:val="MDPI42tablebody"/>
-              <w:jc w:val="left"/>
-              <w:bidi w:val="0"/>
-            </w:pPr>
-            <w:r>
-              <w:rPr>
-                <w:sz w:val="14"/>
-              </w:rPr>
-              <w:t>All buildings; IoU &gt;=0.80; IoU &gt;=0.90</w:t>
+              <w:keepLines/>
+              <w:jc w:val="left"/>
+            </w:pPr>
+            <w:r>
+              <w:rPr>
+                <w:b w:val="0"/>
+              </w:rPr>
+              <w:t>All buildings; IoU ≥0.80; IoU ≥0.90</w:t>
             </w:r>
           </w:p>
         </w:tc>
       </w:tr>
       <w:tr>
+        <w:trPr>
+          <w:cantSplit/>
+        </w:trPr>
         <w:tc>
           <w:tcPr>
             <w:tcW w:type="dxa" w:w="3742"/>
@@ -3810,8 +4256,8 @@
           <w:p>
             <w:pPr>
               <w:pStyle w:val="MDPI42tablebody"/>
-              <w:jc w:val="left"/>
-              <w:bidi w:val="0"/>
+              <w:keepLines/>
+              <w:jc w:val="left"/>
             </w:pPr>
             <w:r>
               <w:rPr>
@@ -3835,8 +4281,8 @@
           <w:p>
             <w:pPr>
               <w:pStyle w:val="MDPI42tablebody"/>
-              <w:jc w:val="left"/>
-              <w:bidi w:val="0"/>
+              <w:keepLines/>
+              <w:jc w:val="left"/>
             </w:pPr>
             <w:r>
               <w:rPr>
@@ -3877,10 +4323,890 @@
         <w:spacing w:before="0" w:after="0" w:line="240" w:lineRule="auto"/>
       </w:pPr>
       <w:r>
-        <w:rPr>
-          <w:sz w:val="16"/>
-        </w:rPr>
-        <w:t>The denser verification search retains the same geometric acceptance rule but adds +/-2.5 degree perturbations around the production orientations and increases the translation search to 11 x 11 offsets. The verification exercise is a numerical sensitivity check; it is not presented as a proof of global rectangle-packing optimality.</w:t>
+        <w:t>The denser verification search retains the same geometric acceptance rule but adds ±2.5° perturbations around the production orientations and increases the translation search to 11 × 11 offsets. The verification exercise is a numerical sensitivity check; it is not presented as a proof of global rectangle-packing optimality.</w:t>
+      </w:r>
+    </w:p>
+    <w:p>
+      <w:pPr>
+        <w:pStyle w:val="MDPI21heading1"/>
+      </w:pPr>
+      <w:r>
+        <w:t>S5. Scale and mathematical-coupling robustness checks</w:t>
+      </w:r>
+    </w:p>
+    <w:p>
+      <w:pPr>
+        <w:pStyle w:val="MDPI31text"/>
+      </w:pPr>
+      <w:r>
+        <w:t>Facet density is defined with gross 3D roof area in the denominator, whereas packing shortfall is defined relative to continuous capacity calculated from setback-adjusted usable area. These denominators are not algebraically identical, but both carry roof scale. Three complementary checks were therefore used to evaluate whether the primary association could be explained mainly by this shared scale: (i) an HC3-robust model with standardized facet density and standardized log gross 3D roof area; (ii) an HC3-robust model with standardized raw facet count and standardized log gross 3D roof area, avoiding a ratio-based fragmentation predictor; and (iii) a partial Spearman analysis obtained by residualizing rank-transformed facet density and packing shortfall against ranked log gross 3D roof area.</w:t>
+      </w:r>
+    </w:p>
+    <w:p>
+      <w:pPr>
+        <w:pStyle w:val="MDPI41tablecaption"/>
+      </w:pPr>
+      <w:r>
+        <w:t>Table S7. HC3-robust building-level regression checks for packing shortfall (n = 31). Continuous predictors are standardized; coefficients are percentage-point changes in shortfall per one standard deviation. Both models use the same outcome.</w:t>
+      </w:r>
+    </w:p>
+    <w:tbl>
+      <w:tblPr>
+        <w:tblW w:type="dxa" w:w="9072"/>
+        <w:jc w:val="center"/>
+        <w:tblLayout w:type="fixed"/>
+        <w:tblLook w:firstColumn="1" w:firstRow="1" w:lastColumn="0" w:lastRow="0" w:noHBand="0" w:noVBand="1" w:val="04A0"/>
+        <w:bidiVisual w:val="0"/>
+      </w:tblPr>
+      <w:tblGrid>
+        <w:gridCol w:w="1512"/>
+        <w:gridCol w:w="1800"/>
+        <w:gridCol w:w="1512"/>
+        <w:gridCol w:w="1224"/>
+        <w:gridCol w:w="1944"/>
+        <w:gridCol w:w="1080"/>
+      </w:tblGrid>
+      <w:tr>
+        <w:trPr>
+          <w:cantSplit/>
+          <w:tblHeader w:val="true"/>
+        </w:trPr>
+        <w:tc>
+          <w:tcPr>
+            <w:tcW w:type="dxa" w:w="1512"/>
+            <w:vAlign w:val="center"/>
+          </w:tcPr>
+          <w:p>
+            <w:pPr>
+              <w:keepLines/>
+              <w:jc w:val="left"/>
+            </w:pPr>
+            <w:r>
+              <w:rPr>
+                <w:b/>
+                <w:sz w:val="17"/>
+              </w:rPr>
+              <w:t>Model</w:t>
+            </w:r>
+          </w:p>
+        </w:tc>
+        <w:tc>
+          <w:tcPr>
+            <w:tcW w:type="dxa" w:w="1800"/>
+            <w:vAlign w:val="center"/>
+          </w:tcPr>
+          <w:p>
+            <w:pPr>
+              <w:keepLines/>
+              <w:jc w:val="left"/>
+            </w:pPr>
+            <w:r>
+              <w:rPr>
+                <w:b/>
+                <w:sz w:val="17"/>
+              </w:rPr>
+              <w:t>Term</w:t>
+            </w:r>
+          </w:p>
+        </w:tc>
+        <w:tc>
+          <w:tcPr>
+            <w:tcW w:type="dxa" w:w="1512"/>
+            <w:vAlign w:val="center"/>
+          </w:tcPr>
+          <w:p>
+            <w:pPr>
+              <w:keepLines/>
+              <w:jc w:val="left"/>
+            </w:pPr>
+            <w:r>
+              <w:rPr>
+                <w:b/>
+                <w:sz w:val="17"/>
+              </w:rPr>
+              <w:t>Coefficient (pp)</w:t>
+            </w:r>
+          </w:p>
+        </w:tc>
+        <w:tc>
+          <w:tcPr>
+            <w:tcW w:type="dxa" w:w="1224"/>
+            <w:vAlign w:val="center"/>
+          </w:tcPr>
+          <w:p>
+            <w:pPr>
+              <w:keepLines/>
+              <w:jc w:val="left"/>
+            </w:pPr>
+            <w:r>
+              <w:rPr>
+                <w:b/>
+                <w:sz w:val="17"/>
+              </w:rPr>
+              <w:t>HC3 SE</w:t>
+            </w:r>
+          </w:p>
+        </w:tc>
+        <w:tc>
+          <w:tcPr>
+            <w:tcW w:type="dxa" w:w="1944"/>
+            <w:vAlign w:val="center"/>
+          </w:tcPr>
+          <w:p>
+            <w:pPr>
+              <w:keepLines/>
+              <w:jc w:val="left"/>
+            </w:pPr>
+            <w:r>
+              <w:rPr>
+                <w:b/>
+                <w:sz w:val="17"/>
+              </w:rPr>
+              <w:t>95% CI</w:t>
+            </w:r>
+          </w:p>
+        </w:tc>
+        <w:tc>
+          <w:tcPr>
+            <w:tcW w:type="dxa" w:w="1080"/>
+            <w:vAlign w:val="center"/>
+          </w:tcPr>
+          <w:p>
+            <w:pPr>
+              <w:keepLines/>
+              <w:jc w:val="left"/>
+            </w:pPr>
+            <w:r>
+              <w:rPr>
+                <w:b/>
+                <w:sz w:val="17"/>
+              </w:rPr>
+              <w:t>p-value</w:t>
+            </w:r>
+          </w:p>
+        </w:tc>
+      </w:tr>
+      <w:tr>
+        <w:trPr>
+          <w:cantSplit/>
+        </w:trPr>
+        <w:tc>
+          <w:tcPr>
+            <w:tcW w:type="dxa" w:w="1512"/>
+            <w:vAlign w:val="center"/>
+          </w:tcPr>
+          <w:p>
+            <w:pPr>
+              <w:keepLines/>
+              <w:jc w:val="left"/>
+            </w:pPr>
+            <w:r>
+              <w:rPr>
+                <w:b w:val="0"/>
+                <w:sz w:val="17"/>
+              </w:rPr>
+              <w:t>A: density + log area</w:t>
+            </w:r>
+          </w:p>
+        </w:tc>
+        <w:tc>
+          <w:tcPr>
+            <w:tcW w:type="dxa" w:w="1800"/>
+            <w:vAlign w:val="center"/>
+          </w:tcPr>
+          <w:p>
+            <w:pPr>
+              <w:keepLines/>
+              <w:jc w:val="left"/>
+            </w:pPr>
+            <w:r>
+              <w:rPr>
+                <w:b w:val="0"/>
+                <w:sz w:val="17"/>
+              </w:rPr>
+              <w:t>Intercept</w:t>
+            </w:r>
+          </w:p>
+        </w:tc>
+        <w:tc>
+          <w:tcPr>
+            <w:tcW w:type="dxa" w:w="1512"/>
+            <w:vAlign w:val="center"/>
+          </w:tcPr>
+          <w:p>
+            <w:pPr>
+              <w:keepLines/>
+              <w:jc w:val="left"/>
+            </w:pPr>
+            <w:r>
+              <w:rPr>
+                <w:b w:val="0"/>
+                <w:sz w:val="17"/>
+              </w:rPr>
+              <w:t>16.296</w:t>
+            </w:r>
+          </w:p>
+        </w:tc>
+        <w:tc>
+          <w:tcPr>
+            <w:tcW w:type="dxa" w:w="1224"/>
+            <w:vAlign w:val="center"/>
+          </w:tcPr>
+          <w:p>
+            <w:pPr>
+              <w:keepLines/>
+              <w:jc w:val="left"/>
+            </w:pPr>
+            <w:r>
+              <w:rPr>
+                <w:b w:val="0"/>
+                <w:sz w:val="17"/>
+              </w:rPr>
+              <w:t>0.701</w:t>
+            </w:r>
+          </w:p>
+        </w:tc>
+        <w:tc>
+          <w:tcPr>
+            <w:tcW w:type="dxa" w:w="1944"/>
+            <w:vAlign w:val="center"/>
+          </w:tcPr>
+          <w:p>
+            <w:pPr>
+              <w:keepLines/>
+              <w:jc w:val="left"/>
+            </w:pPr>
+            <w:r>
+              <w:rPr>
+                <w:b w:val="0"/>
+                <w:sz w:val="17"/>
+              </w:rPr>
+              <w:t>14.922 to 17.670</w:t>
+            </w:r>
+          </w:p>
+        </w:tc>
+        <w:tc>
+          <w:tcPr>
+            <w:tcW w:type="dxa" w:w="1080"/>
+            <w:vAlign w:val="center"/>
+          </w:tcPr>
+          <w:p>
+            <w:pPr>
+              <w:keepLines/>
+              <w:jc w:val="left"/>
+            </w:pPr>
+            <w:r>
+              <w:rPr>
+                <w:b w:val="0"/>
+                <w:sz w:val="17"/>
+              </w:rPr>
+              <w:t>&lt;0.0001</w:t>
+            </w:r>
+          </w:p>
+        </w:tc>
+      </w:tr>
+      <w:tr>
+        <w:trPr>
+          <w:cantSplit/>
+        </w:trPr>
+        <w:tc>
+          <w:tcPr>
+            <w:tcW w:type="dxa" w:w="1512"/>
+            <w:vAlign w:val="center"/>
+          </w:tcPr>
+          <w:p>
+            <w:pPr>
+              <w:keepLines/>
+              <w:jc w:val="left"/>
+            </w:pPr>
+            <w:r>
+              <w:rPr>
+                <w:b w:val="0"/>
+                <w:sz w:val="17"/>
+              </w:rPr>
+              <w:t>A: density + log area</w:t>
+            </w:r>
+          </w:p>
+        </w:tc>
+        <w:tc>
+          <w:tcPr>
+            <w:tcW w:type="dxa" w:w="1800"/>
+            <w:vAlign w:val="center"/>
+          </w:tcPr>
+          <w:p>
+            <w:pPr>
+              <w:keepLines/>
+              <w:jc w:val="left"/>
+            </w:pPr>
+            <w:r>
+              <w:rPr>
+                <w:b w:val="0"/>
+                <w:sz w:val="17"/>
+              </w:rPr>
+              <w:t>Facet density (z)</w:t>
+            </w:r>
+          </w:p>
+        </w:tc>
+        <w:tc>
+          <w:tcPr>
+            <w:tcW w:type="dxa" w:w="1512"/>
+            <w:vAlign w:val="center"/>
+          </w:tcPr>
+          <w:p>
+            <w:pPr>
+              <w:keepLines/>
+              <w:jc w:val="left"/>
+            </w:pPr>
+            <w:r>
+              <w:rPr>
+                <w:b w:val="0"/>
+                <w:sz w:val="17"/>
+              </w:rPr>
+              <w:t>4.220</w:t>
+            </w:r>
+          </w:p>
+        </w:tc>
+        <w:tc>
+          <w:tcPr>
+            <w:tcW w:type="dxa" w:w="1224"/>
+            <w:vAlign w:val="center"/>
+          </w:tcPr>
+          <w:p>
+            <w:pPr>
+              <w:keepLines/>
+              <w:jc w:val="left"/>
+            </w:pPr>
+            <w:r>
+              <w:rPr>
+                <w:b w:val="0"/>
+                <w:sz w:val="17"/>
+              </w:rPr>
+              <w:t>1.399</w:t>
+            </w:r>
+          </w:p>
+        </w:tc>
+        <w:tc>
+          <w:tcPr>
+            <w:tcW w:type="dxa" w:w="1944"/>
+            <w:vAlign w:val="center"/>
+          </w:tcPr>
+          <w:p>
+            <w:pPr>
+              <w:keepLines/>
+              <w:jc w:val="left"/>
+            </w:pPr>
+            <w:r>
+              <w:rPr>
+                <w:b w:val="0"/>
+                <w:sz w:val="17"/>
+              </w:rPr>
+              <w:t>1.477 to 6.962</w:t>
+            </w:r>
+          </w:p>
+        </w:tc>
+        <w:tc>
+          <w:tcPr>
+            <w:tcW w:type="dxa" w:w="1080"/>
+            <w:vAlign w:val="center"/>
+          </w:tcPr>
+          <w:p>
+            <w:pPr>
+              <w:keepLines/>
+              <w:jc w:val="left"/>
+            </w:pPr>
+            <w:r>
+              <w:rPr>
+                <w:b w:val="0"/>
+                <w:sz w:val="17"/>
+              </w:rPr>
+              <w:t>0.0026</w:t>
+            </w:r>
+          </w:p>
+        </w:tc>
+      </w:tr>
+      <w:tr>
+        <w:trPr>
+          <w:cantSplit/>
+        </w:trPr>
+        <w:tc>
+          <w:tcPr>
+            <w:tcW w:type="dxa" w:w="1512"/>
+            <w:vAlign w:val="center"/>
+          </w:tcPr>
+          <w:p>
+            <w:pPr>
+              <w:keepLines/>
+              <w:jc w:val="left"/>
+            </w:pPr>
+            <w:r>
+              <w:rPr>
+                <w:b w:val="0"/>
+                <w:sz w:val="17"/>
+              </w:rPr>
+              <w:t>A: density + log area</w:t>
+            </w:r>
+          </w:p>
+        </w:tc>
+        <w:tc>
+          <w:tcPr>
+            <w:tcW w:type="dxa" w:w="1800"/>
+            <w:vAlign w:val="center"/>
+          </w:tcPr>
+          <w:p>
+            <w:pPr>
+              <w:keepLines/>
+              <w:jc w:val="left"/>
+            </w:pPr>
+            <w:r>
+              <w:rPr>
+                <w:b w:val="0"/>
+                <w:sz w:val="17"/>
+              </w:rPr>
+              <w:t>Log gross 3D roof area (z)</w:t>
+            </w:r>
+          </w:p>
+        </w:tc>
+        <w:tc>
+          <w:tcPr>
+            <w:tcW w:type="dxa" w:w="1512"/>
+            <w:vAlign w:val="center"/>
+          </w:tcPr>
+          <w:p>
+            <w:pPr>
+              <w:keepLines/>
+              <w:jc w:val="left"/>
+            </w:pPr>
+            <w:r>
+              <w:rPr>
+                <w:b w:val="0"/>
+                <w:sz w:val="17"/>
+              </w:rPr>
+              <w:t>−0.078</w:t>
+            </w:r>
+          </w:p>
+        </w:tc>
+        <w:tc>
+          <w:tcPr>
+            <w:tcW w:type="dxa" w:w="1224"/>
+            <w:vAlign w:val="center"/>
+          </w:tcPr>
+          <w:p>
+            <w:pPr>
+              <w:keepLines/>
+              <w:jc w:val="left"/>
+            </w:pPr>
+            <w:r>
+              <w:rPr>
+                <w:b w:val="0"/>
+                <w:sz w:val="17"/>
+              </w:rPr>
+              <w:t>0.866</w:t>
+            </w:r>
+          </w:p>
+        </w:tc>
+        <w:tc>
+          <w:tcPr>
+            <w:tcW w:type="dxa" w:w="1944"/>
+            <w:vAlign w:val="center"/>
+          </w:tcPr>
+          <w:p>
+            <w:pPr>
+              <w:keepLines/>
+              <w:jc w:val="left"/>
+            </w:pPr>
+            <w:r>
+              <w:rPr>
+                <w:b w:val="0"/>
+                <w:sz w:val="17"/>
+              </w:rPr>
+              <w:t>−1.774 to 1.619</w:t>
+            </w:r>
+          </w:p>
+        </w:tc>
+        <w:tc>
+          <w:tcPr>
+            <w:tcW w:type="dxa" w:w="1080"/>
+            <w:vAlign w:val="center"/>
+          </w:tcPr>
+          <w:p>
+            <w:pPr>
+              <w:keepLines/>
+              <w:jc w:val="left"/>
+            </w:pPr>
+            <w:r>
+              <w:rPr>
+                <w:b w:val="0"/>
+                <w:sz w:val="17"/>
+              </w:rPr>
+              <w:t>0.9284</w:t>
+            </w:r>
+          </w:p>
+        </w:tc>
+      </w:tr>
+      <w:tr>
+        <w:trPr>
+          <w:cantSplit/>
+        </w:trPr>
+        <w:tc>
+          <w:tcPr>
+            <w:tcW w:type="dxa" w:w="1512"/>
+            <w:vAlign w:val="center"/>
+          </w:tcPr>
+          <w:p>
+            <w:pPr>
+              <w:keepLines/>
+              <w:jc w:val="left"/>
+            </w:pPr>
+            <w:r>
+              <w:rPr>
+                <w:b w:val="0"/>
+                <w:sz w:val="17"/>
+              </w:rPr>
+              <w:t>B: count + log area</w:t>
+            </w:r>
+          </w:p>
+        </w:tc>
+        <w:tc>
+          <w:tcPr>
+            <w:tcW w:type="dxa" w:w="1800"/>
+            <w:vAlign w:val="center"/>
+          </w:tcPr>
+          <w:p>
+            <w:pPr>
+              <w:keepLines/>
+              <w:jc w:val="left"/>
+            </w:pPr>
+            <w:r>
+              <w:rPr>
+                <w:b w:val="0"/>
+                <w:sz w:val="17"/>
+              </w:rPr>
+              <w:t>Intercept</w:t>
+            </w:r>
+          </w:p>
+        </w:tc>
+        <w:tc>
+          <w:tcPr>
+            <w:tcW w:type="dxa" w:w="1512"/>
+            <w:vAlign w:val="center"/>
+          </w:tcPr>
+          <w:p>
+            <w:pPr>
+              <w:keepLines/>
+              <w:jc w:val="left"/>
+            </w:pPr>
+            <w:r>
+              <w:rPr>
+                <w:b w:val="0"/>
+                <w:sz w:val="17"/>
+              </w:rPr>
+              <w:t>16.296</w:t>
+            </w:r>
+          </w:p>
+        </w:tc>
+        <w:tc>
+          <w:tcPr>
+            <w:tcW w:type="dxa" w:w="1224"/>
+            <w:vAlign w:val="center"/>
+          </w:tcPr>
+          <w:p>
+            <w:pPr>
+              <w:keepLines/>
+              <w:jc w:val="left"/>
+            </w:pPr>
+            <w:r>
+              <w:rPr>
+                <w:b w:val="0"/>
+                <w:sz w:val="17"/>
+              </w:rPr>
+              <w:t>0.997</w:t>
+            </w:r>
+          </w:p>
+        </w:tc>
+        <w:tc>
+          <w:tcPr>
+            <w:tcW w:type="dxa" w:w="1944"/>
+            <w:vAlign w:val="center"/>
+          </w:tcPr>
+          <w:p>
+            <w:pPr>
+              <w:keepLines/>
+              <w:jc w:val="left"/>
+            </w:pPr>
+            <w:r>
+              <w:rPr>
+                <w:b w:val="0"/>
+                <w:sz w:val="17"/>
+              </w:rPr>
+              <w:t>14.342 to 18.251</w:t>
+            </w:r>
+          </w:p>
+        </w:tc>
+        <w:tc>
+          <w:tcPr>
+            <w:tcW w:type="dxa" w:w="1080"/>
+            <w:vAlign w:val="center"/>
+          </w:tcPr>
+          <w:p>
+            <w:pPr>
+              <w:keepLines/>
+              <w:jc w:val="left"/>
+            </w:pPr>
+            <w:r>
+              <w:rPr>
+                <w:b w:val="0"/>
+                <w:sz w:val="17"/>
+              </w:rPr>
+              <w:t>&lt;0.0001</w:t>
+            </w:r>
+          </w:p>
+        </w:tc>
+      </w:tr>
+      <w:tr>
+        <w:trPr>
+          <w:cantSplit/>
+        </w:trPr>
+        <w:tc>
+          <w:tcPr>
+            <w:tcW w:type="dxa" w:w="1512"/>
+            <w:vAlign w:val="center"/>
+          </w:tcPr>
+          <w:p>
+            <w:pPr>
+              <w:keepLines/>
+              <w:jc w:val="left"/>
+            </w:pPr>
+            <w:r>
+              <w:rPr>
+                <w:b w:val="0"/>
+                <w:sz w:val="17"/>
+              </w:rPr>
+              <w:t>B: count + log area</w:t>
+            </w:r>
+          </w:p>
+        </w:tc>
+        <w:tc>
+          <w:tcPr>
+            <w:tcW w:type="dxa" w:w="1800"/>
+            <w:vAlign w:val="center"/>
+          </w:tcPr>
+          <w:p>
+            <w:pPr>
+              <w:keepLines/>
+              <w:jc w:val="left"/>
+            </w:pPr>
+            <w:r>
+              <w:rPr>
+                <w:b w:val="0"/>
+                <w:sz w:val="17"/>
+              </w:rPr>
+              <w:t>Raw physical-facet count (z)</w:t>
+            </w:r>
+          </w:p>
+        </w:tc>
+        <w:tc>
+          <w:tcPr>
+            <w:tcW w:type="dxa" w:w="1512"/>
+            <w:vAlign w:val="center"/>
+          </w:tcPr>
+          <w:p>
+            <w:pPr>
+              <w:keepLines/>
+              <w:jc w:val="left"/>
+            </w:pPr>
+            <w:r>
+              <w:rPr>
+                <w:b w:val="0"/>
+                <w:sz w:val="17"/>
+              </w:rPr>
+              <w:t>1.205</w:t>
+            </w:r>
+          </w:p>
+        </w:tc>
+        <w:tc>
+          <w:tcPr>
+            <w:tcW w:type="dxa" w:w="1224"/>
+            <w:vAlign w:val="center"/>
+          </w:tcPr>
+          <w:p>
+            <w:pPr>
+              <w:keepLines/>
+              <w:jc w:val="left"/>
+            </w:pPr>
+            <w:r>
+              <w:rPr>
+                <w:b w:val="0"/>
+                <w:sz w:val="17"/>
+              </w:rPr>
+              <w:t>1.361</w:t>
+            </w:r>
+          </w:p>
+        </w:tc>
+        <w:tc>
+          <w:tcPr>
+            <w:tcW w:type="dxa" w:w="1944"/>
+            <w:vAlign w:val="center"/>
+          </w:tcPr>
+          <w:p>
+            <w:pPr>
+              <w:keepLines/>
+              <w:jc w:val="left"/>
+            </w:pPr>
+            <w:r>
+              <w:rPr>
+                <w:b w:val="0"/>
+                <w:sz w:val="17"/>
+              </w:rPr>
+              <w:t>−1.464 to 3.873</w:t>
+            </w:r>
+          </w:p>
+        </w:tc>
+        <w:tc>
+          <w:tcPr>
+            <w:tcW w:type="dxa" w:w="1080"/>
+            <w:vAlign w:val="center"/>
+          </w:tcPr>
+          <w:p>
+            <w:pPr>
+              <w:keepLines/>
+              <w:jc w:val="left"/>
+            </w:pPr>
+            <w:r>
+              <w:rPr>
+                <w:b w:val="0"/>
+                <w:sz w:val="17"/>
+              </w:rPr>
+              <w:t>0.3763</w:t>
+            </w:r>
+          </w:p>
+        </w:tc>
+      </w:tr>
+      <w:tr>
+        <w:trPr>
+          <w:cantSplit/>
+        </w:trPr>
+        <w:tc>
+          <w:tcPr>
+            <w:tcW w:type="dxa" w:w="1512"/>
+            <w:vAlign w:val="center"/>
+          </w:tcPr>
+          <w:p>
+            <w:pPr>
+              <w:keepLines/>
+              <w:jc w:val="left"/>
+            </w:pPr>
+            <w:r>
+              <w:rPr>
+                <w:b w:val="0"/>
+                <w:sz w:val="17"/>
+              </w:rPr>
+              <w:t>B: count + log area</w:t>
+            </w:r>
+          </w:p>
+        </w:tc>
+        <w:tc>
+          <w:tcPr>
+            <w:tcW w:type="dxa" w:w="1800"/>
+            <w:vAlign w:val="center"/>
+          </w:tcPr>
+          <w:p>
+            <w:pPr>
+              <w:keepLines/>
+              <w:jc w:val="left"/>
+            </w:pPr>
+            <w:r>
+              <w:rPr>
+                <w:b w:val="0"/>
+                <w:sz w:val="17"/>
+              </w:rPr>
+              <w:t>Log gross 3D roof area (z)</w:t>
+            </w:r>
+          </w:p>
+        </w:tc>
+        <w:tc>
+          <w:tcPr>
+            <w:tcW w:type="dxa" w:w="1512"/>
+            <w:vAlign w:val="center"/>
+          </w:tcPr>
+          <w:p>
+            <w:pPr>
+              <w:keepLines/>
+              <w:jc w:val="left"/>
+            </w:pPr>
+            <w:r>
+              <w:rPr>
+                <w:b w:val="0"/>
+                <w:sz w:val="17"/>
+              </w:rPr>
+              <w:t>−2.416</w:t>
+            </w:r>
+          </w:p>
+        </w:tc>
+        <w:tc>
+          <w:tcPr>
+            <w:tcW w:type="dxa" w:w="1224"/>
+            <w:vAlign w:val="center"/>
+          </w:tcPr>
+          <w:p>
+            <w:pPr>
+              <w:keepLines/>
+              <w:jc w:val="left"/>
+            </w:pPr>
+            <w:r>
+              <w:rPr>
+                <w:b w:val="0"/>
+                <w:sz w:val="17"/>
+              </w:rPr>
+              <w:t>1.450</w:t>
+            </w:r>
+          </w:p>
+        </w:tc>
+        <w:tc>
+          <w:tcPr>
+            <w:tcW w:type="dxa" w:w="1944"/>
+            <w:vAlign w:val="center"/>
+          </w:tcPr>
+          <w:p>
+            <w:pPr>
+              <w:keepLines/>
+              <w:jc w:val="left"/>
+            </w:pPr>
+            <w:r>
+              <w:rPr>
+                <w:b w:val="0"/>
+                <w:sz w:val="17"/>
+              </w:rPr>
+              <w:t>−5.258 to 0.427</w:t>
+            </w:r>
+          </w:p>
+        </w:tc>
+        <w:tc>
+          <w:tcPr>
+            <w:tcW w:type="dxa" w:w="1080"/>
+            <w:vAlign w:val="center"/>
+          </w:tcPr>
+          <w:p>
+            <w:pPr>
+              <w:keepLines/>
+              <w:jc w:val="left"/>
+            </w:pPr>
+            <w:r>
+              <w:rPr>
+                <w:b w:val="0"/>
+                <w:sz w:val="17"/>
+              </w:rPr>
+              <w:t>0.0958</w:t>
+            </w:r>
+          </w:p>
+        </w:tc>
+      </w:tr>
+    </w:tbl>
+    <w:p>
+      <w:pPr>
+        <w:pStyle w:val="MDPI31text"/>
+      </w:pPr>
+      <w:r>
+        <w:t>Model A has R² = 0.641 (adjusted R² = 0.615); Model B has R² = 0.140 (adjusted R² = 0.079). For the residual-rank partial Spearman check, the association between facet density and packing shortfall after adjustment for ranked log gross 3D roof area is partial Spearman ρ = 0.622 (two-sided p = 0.00025). The density association is therefore retained after a monotonic size adjustment, while raw facet count is not independently significant in the count-plus-area model. These are robustness checks for the bounded test window, not causal or city-level estimates.</w:t>
       </w:r>
     </w:p>
     <w:sectPr>

</xml_diff>